<commit_message>
Actualizacion documentacion, incorporacion parte econonimica
</commit_message>
<xml_diff>
--- a/Documentos/Proyecto/Proyecto_Transportes_Genesis.docx
+++ b/Documentos/Proyecto/Proyecto_Transportes_Genesis.docx
@@ -5,6 +5,7 @@
     <w:p>
       <w:pPr>
         <w:spacing w:line="240" w:lineRule="atLeast"/>
+        <w:ind w:left="720" w:hanging="720"/>
         <w:jc w:val="center"/>
         <w:rPr>
           <w:b/>
@@ -482,7 +483,7 @@
           <w:r>
             <w:fldChar w:fldCharType="separate"/>
           </w:r>
-          <w:hyperlink w:anchor="_Toc229242233" w:history="1">
+          <w:hyperlink w:anchor="_Toc229485375" w:history="1">
             <w:r>
               <w:rPr>
                 <w:rStyle w:val="Hipervnculo"/>
@@ -509,7 +510,7 @@
                 <w:noProof/>
                 <w:webHidden/>
               </w:rPr>
-              <w:instrText xml:space="preserve"> PAGEREF _Toc229242233 \h </w:instrText>
+              <w:instrText xml:space="preserve"> PAGEREF _Toc229485375 \h </w:instrText>
             </w:r>
             <w:r>
               <w:rPr>
@@ -554,7 +555,7 @@
               <w14:ligatures w14:val="standardContextual"/>
             </w:rPr>
           </w:pPr>
-          <w:hyperlink w:anchor="_Toc229242234" w:history="1">
+          <w:hyperlink w:anchor="_Toc229485376" w:history="1">
             <w:r>
               <w:rPr>
                 <w:rStyle w:val="Hipervnculo"/>
@@ -581,7 +582,7 @@
                 <w:noProof/>
                 <w:webHidden/>
               </w:rPr>
-              <w:instrText xml:space="preserve"> PAGEREF _Toc229242234 \h </w:instrText>
+              <w:instrText xml:space="preserve"> PAGEREF _Toc229485376 \h </w:instrText>
             </w:r>
             <w:r>
               <w:rPr>
@@ -626,7 +627,7 @@
               <w14:ligatures w14:val="standardContextual"/>
             </w:rPr>
           </w:pPr>
-          <w:hyperlink w:anchor="_Toc229242235" w:history="1">
+          <w:hyperlink w:anchor="_Toc229485377" w:history="1">
             <w:r>
               <w:rPr>
                 <w:rStyle w:val="Hipervnculo"/>
@@ -653,7 +654,7 @@
                 <w:noProof/>
                 <w:webHidden/>
               </w:rPr>
-              <w:instrText xml:space="preserve"> PAGEREF _Toc229242235 \h </w:instrText>
+              <w:instrText xml:space="preserve"> PAGEREF _Toc229485377 \h </w:instrText>
             </w:r>
             <w:r>
               <w:rPr>
@@ -698,7 +699,7 @@
               <w14:ligatures w14:val="standardContextual"/>
             </w:rPr>
           </w:pPr>
-          <w:hyperlink w:anchor="_Toc229242236" w:history="1">
+          <w:hyperlink w:anchor="_Toc229485378" w:history="1">
             <w:r>
               <w:rPr>
                 <w:rStyle w:val="Hipervnculo"/>
@@ -725,7 +726,7 @@
                 <w:noProof/>
                 <w:webHidden/>
               </w:rPr>
-              <w:instrText xml:space="preserve"> PAGEREF _Toc229242236 \h </w:instrText>
+              <w:instrText xml:space="preserve"> PAGEREF _Toc229485378 \h </w:instrText>
             </w:r>
             <w:r>
               <w:rPr>
@@ -770,7 +771,7 @@
               <w14:ligatures w14:val="standardContextual"/>
             </w:rPr>
           </w:pPr>
-          <w:hyperlink w:anchor="_Toc229242237" w:history="1">
+          <w:hyperlink w:anchor="_Toc229485379" w:history="1">
             <w:r>
               <w:rPr>
                 <w:rStyle w:val="Hipervnculo"/>
@@ -797,7 +798,7 @@
                 <w:noProof/>
                 <w:webHidden/>
               </w:rPr>
-              <w:instrText xml:space="preserve"> PAGEREF _Toc229242237 \h </w:instrText>
+              <w:instrText xml:space="preserve"> PAGEREF _Toc229485379 \h </w:instrText>
             </w:r>
             <w:r>
               <w:rPr>
@@ -842,7 +843,7 @@
               <w14:ligatures w14:val="standardContextual"/>
             </w:rPr>
           </w:pPr>
-          <w:hyperlink w:anchor="_Toc229242238" w:history="1">
+          <w:hyperlink w:anchor="_Toc229485380" w:history="1">
             <w:r>
               <w:rPr>
                 <w:rStyle w:val="Hipervnculo"/>
@@ -869,7 +870,7 @@
                 <w:noProof/>
                 <w:webHidden/>
               </w:rPr>
-              <w:instrText xml:space="preserve"> PAGEREF _Toc229242238 \h </w:instrText>
+              <w:instrText xml:space="preserve"> PAGEREF _Toc229485380 \h </w:instrText>
             </w:r>
             <w:r>
               <w:rPr>
@@ -914,7 +915,7 @@
               <w14:ligatures w14:val="standardContextual"/>
             </w:rPr>
           </w:pPr>
-          <w:hyperlink w:anchor="_Toc229242239" w:history="1">
+          <w:hyperlink w:anchor="_Toc229485381" w:history="1">
             <w:r>
               <w:rPr>
                 <w:rStyle w:val="Hipervnculo"/>
@@ -941,7 +942,7 @@
                 <w:noProof/>
                 <w:webHidden/>
               </w:rPr>
-              <w:instrText xml:space="preserve"> PAGEREF _Toc229242239 \h </w:instrText>
+              <w:instrText xml:space="preserve"> PAGEREF _Toc229485381 \h </w:instrText>
             </w:r>
             <w:r>
               <w:rPr>
@@ -986,7 +987,7 @@
               <w14:ligatures w14:val="standardContextual"/>
             </w:rPr>
           </w:pPr>
-          <w:hyperlink w:anchor="_Toc229242240" w:history="1">
+          <w:hyperlink w:anchor="_Toc229485382" w:history="1">
             <w:r>
               <w:rPr>
                 <w:rStyle w:val="Hipervnculo"/>
@@ -1013,7 +1014,7 @@
                 <w:noProof/>
                 <w:webHidden/>
               </w:rPr>
-              <w:instrText xml:space="preserve"> PAGEREF _Toc229242240 \h </w:instrText>
+              <w:instrText xml:space="preserve"> PAGEREF _Toc229485382 \h </w:instrText>
             </w:r>
             <w:r>
               <w:rPr>
@@ -1058,7 +1059,7 @@
               <w14:ligatures w14:val="standardContextual"/>
             </w:rPr>
           </w:pPr>
-          <w:hyperlink w:anchor="_Toc229242241" w:history="1">
+          <w:hyperlink w:anchor="_Toc229485383" w:history="1">
             <w:r>
               <w:rPr>
                 <w:rStyle w:val="Hipervnculo"/>
@@ -1085,7 +1086,7 @@
                 <w:noProof/>
                 <w:webHidden/>
               </w:rPr>
-              <w:instrText xml:space="preserve"> PAGEREF _Toc229242241 \h </w:instrText>
+              <w:instrText xml:space="preserve"> PAGEREF _Toc229485383 \h </w:instrText>
             </w:r>
             <w:r>
               <w:rPr>
@@ -1130,7 +1131,7 @@
               <w14:ligatures w14:val="standardContextual"/>
             </w:rPr>
           </w:pPr>
-          <w:hyperlink w:anchor="_Toc229242242" w:history="1">
+          <w:hyperlink w:anchor="_Toc229485384" w:history="1">
             <w:r>
               <w:rPr>
                 <w:rStyle w:val="Hipervnculo"/>
@@ -1157,7 +1158,7 @@
                 <w:noProof/>
                 <w:webHidden/>
               </w:rPr>
-              <w:instrText xml:space="preserve"> PAGEREF _Toc229242242 \h </w:instrText>
+              <w:instrText xml:space="preserve"> PAGEREF _Toc229485384 \h </w:instrText>
             </w:r>
             <w:r>
               <w:rPr>
@@ -1202,7 +1203,7 @@
               <w14:ligatures w14:val="standardContextual"/>
             </w:rPr>
           </w:pPr>
-          <w:hyperlink w:anchor="_Toc229242243" w:history="1">
+          <w:hyperlink w:anchor="_Toc229485385" w:history="1">
             <w:r>
               <w:rPr>
                 <w:rStyle w:val="Hipervnculo"/>
@@ -1229,7 +1230,7 @@
                 <w:noProof/>
                 <w:webHidden/>
               </w:rPr>
-              <w:instrText xml:space="preserve"> PAGEREF _Toc229242243 \h </w:instrText>
+              <w:instrText xml:space="preserve"> PAGEREF _Toc229485385 \h </w:instrText>
             </w:r>
             <w:r>
               <w:rPr>
@@ -1274,7 +1275,7 @@
               <w14:ligatures w14:val="standardContextual"/>
             </w:rPr>
           </w:pPr>
-          <w:hyperlink w:anchor="_Toc229242244" w:history="1">
+          <w:hyperlink w:anchor="_Toc229485386" w:history="1">
             <w:r>
               <w:rPr>
                 <w:rStyle w:val="Hipervnculo"/>
@@ -1301,7 +1302,7 @@
                 <w:noProof/>
                 <w:webHidden/>
               </w:rPr>
-              <w:instrText xml:space="preserve"> PAGEREF _Toc229242244 \h </w:instrText>
+              <w:instrText xml:space="preserve"> PAGEREF _Toc229485386 \h </w:instrText>
             </w:r>
             <w:r>
               <w:rPr>
@@ -1346,7 +1347,7 @@
               <w14:ligatures w14:val="standardContextual"/>
             </w:rPr>
           </w:pPr>
-          <w:hyperlink w:anchor="_Toc229242245" w:history="1">
+          <w:hyperlink w:anchor="_Toc229485387" w:history="1">
             <w:r>
               <w:rPr>
                 <w:rStyle w:val="Hipervnculo"/>
@@ -1373,7 +1374,7 @@
                 <w:noProof/>
                 <w:webHidden/>
               </w:rPr>
-              <w:instrText xml:space="preserve"> PAGEREF _Toc229242245 \h </w:instrText>
+              <w:instrText xml:space="preserve"> PAGEREF _Toc229485387 \h </w:instrText>
             </w:r>
             <w:r>
               <w:rPr>
@@ -1418,7 +1419,7 @@
               <w14:ligatures w14:val="standardContextual"/>
             </w:rPr>
           </w:pPr>
-          <w:hyperlink w:anchor="_Toc229242246" w:history="1">
+          <w:hyperlink w:anchor="_Toc229485388" w:history="1">
             <w:r>
               <w:rPr>
                 <w:rStyle w:val="Hipervnculo"/>
@@ -1445,7 +1446,7 @@
                 <w:noProof/>
                 <w:webHidden/>
               </w:rPr>
-              <w:instrText xml:space="preserve"> PAGEREF _Toc229242246 \h </w:instrText>
+              <w:instrText xml:space="preserve"> PAGEREF _Toc229485388 \h </w:instrText>
             </w:r>
             <w:r>
               <w:rPr>
@@ -1490,7 +1491,7 @@
               <w14:ligatures w14:val="standardContextual"/>
             </w:rPr>
           </w:pPr>
-          <w:hyperlink w:anchor="_Toc229242247" w:history="1">
+          <w:hyperlink w:anchor="_Toc229485389" w:history="1">
             <w:r>
               <w:rPr>
                 <w:rStyle w:val="Hipervnculo"/>
@@ -1517,7 +1518,7 @@
                 <w:noProof/>
                 <w:webHidden/>
               </w:rPr>
-              <w:instrText xml:space="preserve"> PAGEREF _Toc229242247 \h </w:instrText>
+              <w:instrText xml:space="preserve"> PAGEREF _Toc229485389 \h </w:instrText>
             </w:r>
             <w:r>
               <w:rPr>
@@ -1562,7 +1563,7 @@
               <w14:ligatures w14:val="standardContextual"/>
             </w:rPr>
           </w:pPr>
-          <w:hyperlink w:anchor="_Toc229242248" w:history="1">
+          <w:hyperlink w:anchor="_Toc229485390" w:history="1">
             <w:r>
               <w:rPr>
                 <w:rStyle w:val="Hipervnculo"/>
@@ -1589,7 +1590,7 @@
                 <w:noProof/>
                 <w:webHidden/>
               </w:rPr>
-              <w:instrText xml:space="preserve"> PAGEREF _Toc229242248 \h </w:instrText>
+              <w:instrText xml:space="preserve"> PAGEREF _Toc229485390 \h </w:instrText>
             </w:r>
             <w:r>
               <w:rPr>
@@ -1634,7 +1635,7 @@
               <w14:ligatures w14:val="standardContextual"/>
             </w:rPr>
           </w:pPr>
-          <w:hyperlink w:anchor="_Toc229242249" w:history="1">
+          <w:hyperlink w:anchor="_Toc229485391" w:history="1">
             <w:r>
               <w:rPr>
                 <w:rStyle w:val="Hipervnculo"/>
@@ -1661,7 +1662,7 @@
                 <w:noProof/>
                 <w:webHidden/>
               </w:rPr>
-              <w:instrText xml:space="preserve"> PAGEREF _Toc229242249 \h </w:instrText>
+              <w:instrText xml:space="preserve"> PAGEREF _Toc229485391 \h </w:instrText>
             </w:r>
             <w:r>
               <w:rPr>
@@ -1706,7 +1707,7 @@
               <w14:ligatures w14:val="standardContextual"/>
             </w:rPr>
           </w:pPr>
-          <w:hyperlink w:anchor="_Toc229242250" w:history="1">
+          <w:hyperlink w:anchor="_Toc229485392" w:history="1">
             <w:r>
               <w:rPr>
                 <w:rStyle w:val="Hipervnculo"/>
@@ -1733,7 +1734,7 @@
                 <w:noProof/>
                 <w:webHidden/>
               </w:rPr>
-              <w:instrText xml:space="preserve"> PAGEREF _Toc229242250 \h </w:instrText>
+              <w:instrText xml:space="preserve"> PAGEREF _Toc229485392 \h </w:instrText>
             </w:r>
             <w:r>
               <w:rPr>
@@ -1778,7 +1779,7 @@
               <w14:ligatures w14:val="standardContextual"/>
             </w:rPr>
           </w:pPr>
-          <w:hyperlink w:anchor="_Toc229242251" w:history="1">
+          <w:hyperlink w:anchor="_Toc229485393" w:history="1">
             <w:r>
               <w:rPr>
                 <w:rStyle w:val="Hipervnculo"/>
@@ -1805,7 +1806,7 @@
                 <w:noProof/>
                 <w:webHidden/>
               </w:rPr>
-              <w:instrText xml:space="preserve"> PAGEREF _Toc229242251 \h </w:instrText>
+              <w:instrText xml:space="preserve"> PAGEREF _Toc229485393 \h </w:instrText>
             </w:r>
             <w:r>
               <w:rPr>
@@ -1850,7 +1851,7 @@
               <w14:ligatures w14:val="standardContextual"/>
             </w:rPr>
           </w:pPr>
-          <w:hyperlink w:anchor="_Toc229242252" w:history="1">
+          <w:hyperlink w:anchor="_Toc229485394" w:history="1">
             <w:r>
               <w:rPr>
                 <w:rStyle w:val="Hipervnculo"/>
@@ -1877,7 +1878,7 @@
                 <w:noProof/>
                 <w:webHidden/>
               </w:rPr>
-              <w:instrText xml:space="preserve"> PAGEREF _Toc229242252 \h </w:instrText>
+              <w:instrText xml:space="preserve"> PAGEREF _Toc229485394 \h </w:instrText>
             </w:r>
             <w:r>
               <w:rPr>
@@ -1922,7 +1923,7 @@
               <w14:ligatures w14:val="standardContextual"/>
             </w:rPr>
           </w:pPr>
-          <w:hyperlink w:anchor="_Toc229242253" w:history="1">
+          <w:hyperlink w:anchor="_Toc229485395" w:history="1">
             <w:r>
               <w:rPr>
                 <w:rStyle w:val="Hipervnculo"/>
@@ -1949,7 +1950,7 @@
                 <w:noProof/>
                 <w:webHidden/>
               </w:rPr>
-              <w:instrText xml:space="preserve"> PAGEREF _Toc229242253 \h </w:instrText>
+              <w:instrText xml:space="preserve"> PAGEREF _Toc229485395 \h </w:instrText>
             </w:r>
             <w:r>
               <w:rPr>
@@ -1994,7 +1995,7 @@
               <w14:ligatures w14:val="standardContextual"/>
             </w:rPr>
           </w:pPr>
-          <w:hyperlink w:anchor="_Toc229242254" w:history="1">
+          <w:hyperlink w:anchor="_Toc229485396" w:history="1">
             <w:r>
               <w:rPr>
                 <w:rStyle w:val="Hipervnculo"/>
@@ -2021,7 +2022,7 @@
                 <w:noProof/>
                 <w:webHidden/>
               </w:rPr>
-              <w:instrText xml:space="preserve"> PAGEREF _Toc229242254 \h </w:instrText>
+              <w:instrText xml:space="preserve"> PAGEREF _Toc229485396 \h </w:instrText>
             </w:r>
             <w:r>
               <w:rPr>
@@ -2066,7 +2067,7 @@
               <w14:ligatures w14:val="standardContextual"/>
             </w:rPr>
           </w:pPr>
-          <w:hyperlink w:anchor="_Toc229242255" w:history="1">
+          <w:hyperlink w:anchor="_Toc229485397" w:history="1">
             <w:r>
               <w:rPr>
                 <w:rStyle w:val="Hipervnculo"/>
@@ -2093,7 +2094,7 @@
                 <w:noProof/>
                 <w:webHidden/>
               </w:rPr>
-              <w:instrText xml:space="preserve"> PAGEREF _Toc229242255 \h </w:instrText>
+              <w:instrText xml:space="preserve"> PAGEREF _Toc229485397 \h </w:instrText>
             </w:r>
             <w:r>
               <w:rPr>
@@ -2138,7 +2139,7 @@
               <w14:ligatures w14:val="standardContextual"/>
             </w:rPr>
           </w:pPr>
-          <w:hyperlink w:anchor="_Toc229242256" w:history="1">
+          <w:hyperlink w:anchor="_Toc229485398" w:history="1">
             <w:r>
               <w:rPr>
                 <w:rStyle w:val="Hipervnculo"/>
@@ -2165,7 +2166,7 @@
                 <w:noProof/>
                 <w:webHidden/>
               </w:rPr>
-              <w:instrText xml:space="preserve"> PAGEREF _Toc229242256 \h </w:instrText>
+              <w:instrText xml:space="preserve"> PAGEREF _Toc229485398 \h </w:instrText>
             </w:r>
             <w:r>
               <w:rPr>
@@ -2210,7 +2211,7 @@
               <w14:ligatures w14:val="standardContextual"/>
             </w:rPr>
           </w:pPr>
-          <w:hyperlink w:anchor="_Toc229242257" w:history="1">
+          <w:hyperlink w:anchor="_Toc229485399" w:history="1">
             <w:r>
               <w:rPr>
                 <w:rStyle w:val="Hipervnculo"/>
@@ -2237,7 +2238,7 @@
                 <w:noProof/>
                 <w:webHidden/>
               </w:rPr>
-              <w:instrText xml:space="preserve"> PAGEREF _Toc229242257 \h </w:instrText>
+              <w:instrText xml:space="preserve"> PAGEREF _Toc229485399 \h </w:instrText>
             </w:r>
             <w:r>
               <w:rPr>
@@ -2282,7 +2283,7 @@
               <w14:ligatures w14:val="standardContextual"/>
             </w:rPr>
           </w:pPr>
-          <w:hyperlink w:anchor="_Toc229242258" w:history="1">
+          <w:hyperlink w:anchor="_Toc229485400" w:history="1">
             <w:r>
               <w:rPr>
                 <w:rStyle w:val="Hipervnculo"/>
@@ -2309,7 +2310,7 @@
                 <w:noProof/>
                 <w:webHidden/>
               </w:rPr>
-              <w:instrText xml:space="preserve"> PAGEREF _Toc229242258 \h </w:instrText>
+              <w:instrText xml:space="preserve"> PAGEREF _Toc229485400 \h </w:instrText>
             </w:r>
             <w:r>
               <w:rPr>
@@ -2354,7 +2355,7 @@
               <w14:ligatures w14:val="standardContextual"/>
             </w:rPr>
           </w:pPr>
-          <w:hyperlink w:anchor="_Toc229242259" w:history="1">
+          <w:hyperlink w:anchor="_Toc229485401" w:history="1">
             <w:r>
               <w:rPr>
                 <w:rStyle w:val="Hipervnculo"/>
@@ -2381,7 +2382,7 @@
                 <w:noProof/>
                 <w:webHidden/>
               </w:rPr>
-              <w:instrText xml:space="preserve"> PAGEREF _Toc229242259 \h </w:instrText>
+              <w:instrText xml:space="preserve"> PAGEREF _Toc229485401 \h </w:instrText>
             </w:r>
             <w:r>
               <w:rPr>
@@ -2426,7 +2427,7 @@
               <w14:ligatures w14:val="standardContextual"/>
             </w:rPr>
           </w:pPr>
-          <w:hyperlink w:anchor="_Toc229242260" w:history="1">
+          <w:hyperlink w:anchor="_Toc229485402" w:history="1">
             <w:r>
               <w:rPr>
                 <w:rStyle w:val="Hipervnculo"/>
@@ -2453,7 +2454,7 @@
                 <w:noProof/>
                 <w:webHidden/>
               </w:rPr>
-              <w:instrText xml:space="preserve"> PAGEREF _Toc229242260 \h </w:instrText>
+              <w:instrText xml:space="preserve"> PAGEREF _Toc229485402 \h </w:instrText>
             </w:r>
             <w:r>
               <w:rPr>
@@ -2498,7 +2499,7 @@
               <w14:ligatures w14:val="standardContextual"/>
             </w:rPr>
           </w:pPr>
-          <w:hyperlink w:anchor="_Toc229242261" w:history="1">
+          <w:hyperlink w:anchor="_Toc229485403" w:history="1">
             <w:r>
               <w:rPr>
                 <w:rStyle w:val="Hipervnculo"/>
@@ -2525,7 +2526,7 @@
                 <w:noProof/>
                 <w:webHidden/>
               </w:rPr>
-              <w:instrText xml:space="preserve"> PAGEREF _Toc229242261 \h </w:instrText>
+              <w:instrText xml:space="preserve"> PAGEREF _Toc229485403 \h </w:instrText>
             </w:r>
             <w:r>
               <w:rPr>
@@ -2570,7 +2571,7 @@
               <w14:ligatures w14:val="standardContextual"/>
             </w:rPr>
           </w:pPr>
-          <w:hyperlink w:anchor="_Toc229242262" w:history="1">
+          <w:hyperlink w:anchor="_Toc229485404" w:history="1">
             <w:r>
               <w:rPr>
                 <w:rStyle w:val="Hipervnculo"/>
@@ -2597,7 +2598,7 @@
                 <w:noProof/>
                 <w:webHidden/>
               </w:rPr>
-              <w:instrText xml:space="preserve"> PAGEREF _Toc229242262 \h </w:instrText>
+              <w:instrText xml:space="preserve"> PAGEREF _Toc229485404 \h </w:instrText>
             </w:r>
             <w:r>
               <w:rPr>
@@ -2642,7 +2643,7 @@
               <w14:ligatures w14:val="standardContextual"/>
             </w:rPr>
           </w:pPr>
-          <w:hyperlink w:anchor="_Toc229242263" w:history="1">
+          <w:hyperlink w:anchor="_Toc229485405" w:history="1">
             <w:r>
               <w:rPr>
                 <w:rStyle w:val="Hipervnculo"/>
@@ -2669,7 +2670,7 @@
                 <w:noProof/>
                 <w:webHidden/>
               </w:rPr>
-              <w:instrText xml:space="preserve"> PAGEREF _Toc229242263 \h </w:instrText>
+              <w:instrText xml:space="preserve"> PAGEREF _Toc229485405 \h </w:instrText>
             </w:r>
             <w:r>
               <w:rPr>
@@ -2714,7 +2715,7 @@
               <w14:ligatures w14:val="standardContextual"/>
             </w:rPr>
           </w:pPr>
-          <w:hyperlink w:anchor="_Toc229242264" w:history="1">
+          <w:hyperlink w:anchor="_Toc229485406" w:history="1">
             <w:r>
               <w:rPr>
                 <w:rStyle w:val="Hipervnculo"/>
@@ -2741,7 +2742,7 @@
                 <w:noProof/>
                 <w:webHidden/>
               </w:rPr>
-              <w:instrText xml:space="preserve"> PAGEREF _Toc229242264 \h </w:instrText>
+              <w:instrText xml:space="preserve"> PAGEREF _Toc229485406 \h </w:instrText>
             </w:r>
             <w:r>
               <w:rPr>
@@ -2786,7 +2787,7 @@
               <w14:ligatures w14:val="standardContextual"/>
             </w:rPr>
           </w:pPr>
-          <w:hyperlink w:anchor="_Toc229242265" w:history="1">
+          <w:hyperlink w:anchor="_Toc229485407" w:history="1">
             <w:r>
               <w:rPr>
                 <w:rStyle w:val="Hipervnculo"/>
@@ -2813,7 +2814,7 @@
                 <w:noProof/>
                 <w:webHidden/>
               </w:rPr>
-              <w:instrText xml:space="preserve"> PAGEREF _Toc229242265 \h </w:instrText>
+              <w:instrText xml:space="preserve"> PAGEREF _Toc229485407 \h </w:instrText>
             </w:r>
             <w:r>
               <w:rPr>
@@ -2858,7 +2859,7 @@
               <w14:ligatures w14:val="standardContextual"/>
             </w:rPr>
           </w:pPr>
-          <w:hyperlink w:anchor="_Toc229242266" w:history="1">
+          <w:hyperlink w:anchor="_Toc229485408" w:history="1">
             <w:r>
               <w:rPr>
                 <w:rStyle w:val="Hipervnculo"/>
@@ -2885,7 +2886,7 @@
                 <w:noProof/>
                 <w:webHidden/>
               </w:rPr>
-              <w:instrText xml:space="preserve"> PAGEREF _Toc229242266 \h </w:instrText>
+              <w:instrText xml:space="preserve"> PAGEREF _Toc229485408 \h </w:instrText>
             </w:r>
             <w:r>
               <w:rPr>
@@ -2930,7 +2931,7 @@
               <w14:ligatures w14:val="standardContextual"/>
             </w:rPr>
           </w:pPr>
-          <w:hyperlink w:anchor="_Toc229242267" w:history="1">
+          <w:hyperlink w:anchor="_Toc229485409" w:history="1">
             <w:r>
               <w:rPr>
                 <w:rStyle w:val="Hipervnculo"/>
@@ -2957,7 +2958,7 @@
                 <w:noProof/>
                 <w:webHidden/>
               </w:rPr>
-              <w:instrText xml:space="preserve"> PAGEREF _Toc229242267 \h </w:instrText>
+              <w:instrText xml:space="preserve"> PAGEREF _Toc229485409 \h </w:instrText>
             </w:r>
             <w:r>
               <w:rPr>
@@ -3002,7 +3003,7 @@
               <w14:ligatures w14:val="standardContextual"/>
             </w:rPr>
           </w:pPr>
-          <w:hyperlink w:anchor="_Toc229242268" w:history="1">
+          <w:hyperlink w:anchor="_Toc229485410" w:history="1">
             <w:r>
               <w:rPr>
                 <w:rStyle w:val="Hipervnculo"/>
@@ -3029,7 +3030,7 @@
                 <w:noProof/>
                 <w:webHidden/>
               </w:rPr>
-              <w:instrText xml:space="preserve"> PAGEREF _Toc229242268 \h </w:instrText>
+              <w:instrText xml:space="preserve"> PAGEREF _Toc229485410 \h </w:instrText>
             </w:r>
             <w:r>
               <w:rPr>
@@ -3074,7 +3075,7 @@
               <w14:ligatures w14:val="standardContextual"/>
             </w:rPr>
           </w:pPr>
-          <w:hyperlink w:anchor="_Toc229242269" w:history="1">
+          <w:hyperlink w:anchor="_Toc229485411" w:history="1">
             <w:r>
               <w:rPr>
                 <w:rStyle w:val="Hipervnculo"/>
@@ -3101,7 +3102,7 @@
                 <w:noProof/>
                 <w:webHidden/>
               </w:rPr>
-              <w:instrText xml:space="preserve"> PAGEREF _Toc229242269 \h </w:instrText>
+              <w:instrText xml:space="preserve"> PAGEREF _Toc229485411 \h </w:instrText>
             </w:r>
             <w:r>
               <w:rPr>
@@ -3146,7 +3147,7 @@
               <w14:ligatures w14:val="standardContextual"/>
             </w:rPr>
           </w:pPr>
-          <w:hyperlink w:anchor="_Toc229242270" w:history="1">
+          <w:hyperlink w:anchor="_Toc229485412" w:history="1">
             <w:r>
               <w:rPr>
                 <w:rStyle w:val="Hipervnculo"/>
@@ -3173,7 +3174,7 @@
                 <w:noProof/>
                 <w:webHidden/>
               </w:rPr>
-              <w:instrText xml:space="preserve"> PAGEREF _Toc229242270 \h </w:instrText>
+              <w:instrText xml:space="preserve"> PAGEREF _Toc229485412 \h </w:instrText>
             </w:r>
             <w:r>
               <w:rPr>
@@ -3218,7 +3219,7 @@
               <w14:ligatures w14:val="standardContextual"/>
             </w:rPr>
           </w:pPr>
-          <w:hyperlink w:anchor="_Toc229242271" w:history="1">
+          <w:hyperlink w:anchor="_Toc229485413" w:history="1">
             <w:r>
               <w:rPr>
                 <w:rStyle w:val="Hipervnculo"/>
@@ -3245,7 +3246,7 @@
                 <w:noProof/>
                 <w:webHidden/>
               </w:rPr>
-              <w:instrText xml:space="preserve"> PAGEREF _Toc229242271 \h </w:instrText>
+              <w:instrText xml:space="preserve"> PAGEREF _Toc229485413 \h </w:instrText>
             </w:r>
             <w:r>
               <w:rPr>
@@ -3290,7 +3291,7 @@
               <w14:ligatures w14:val="standardContextual"/>
             </w:rPr>
           </w:pPr>
-          <w:hyperlink w:anchor="_Toc229242272" w:history="1">
+          <w:hyperlink w:anchor="_Toc229485414" w:history="1">
             <w:r>
               <w:rPr>
                 <w:rStyle w:val="Hipervnculo"/>
@@ -3317,7 +3318,7 @@
                 <w:noProof/>
                 <w:webHidden/>
               </w:rPr>
-              <w:instrText xml:space="preserve"> PAGEREF _Toc229242272 \h </w:instrText>
+              <w:instrText xml:space="preserve"> PAGEREF _Toc229485414 \h </w:instrText>
             </w:r>
             <w:r>
               <w:rPr>
@@ -3362,7 +3363,7 @@
               <w14:ligatures w14:val="standardContextual"/>
             </w:rPr>
           </w:pPr>
-          <w:hyperlink w:anchor="_Toc229242273" w:history="1">
+          <w:hyperlink w:anchor="_Toc229485415" w:history="1">
             <w:r>
               <w:rPr>
                 <w:rStyle w:val="Hipervnculo"/>
@@ -3389,7 +3390,7 @@
                 <w:noProof/>
                 <w:webHidden/>
               </w:rPr>
-              <w:instrText xml:space="preserve"> PAGEREF _Toc229242273 \h </w:instrText>
+              <w:instrText xml:space="preserve"> PAGEREF _Toc229485415 \h </w:instrText>
             </w:r>
             <w:r>
               <w:rPr>
@@ -3434,7 +3435,7 @@
               <w14:ligatures w14:val="standardContextual"/>
             </w:rPr>
           </w:pPr>
-          <w:hyperlink w:anchor="_Toc229242274" w:history="1">
+          <w:hyperlink w:anchor="_Toc229485416" w:history="1">
             <w:r>
               <w:rPr>
                 <w:rStyle w:val="Hipervnculo"/>
@@ -3461,7 +3462,7 @@
                 <w:noProof/>
                 <w:webHidden/>
               </w:rPr>
-              <w:instrText xml:space="preserve"> PAGEREF _Toc229242274 \h </w:instrText>
+              <w:instrText xml:space="preserve"> PAGEREF _Toc229485416 \h </w:instrText>
             </w:r>
             <w:r>
               <w:rPr>
@@ -3506,7 +3507,7 @@
               <w14:ligatures w14:val="standardContextual"/>
             </w:rPr>
           </w:pPr>
-          <w:hyperlink w:anchor="_Toc229242275" w:history="1">
+          <w:hyperlink w:anchor="_Toc229485417" w:history="1">
             <w:r>
               <w:rPr>
                 <w:rStyle w:val="Hipervnculo"/>
@@ -3533,7 +3534,7 @@
                 <w:noProof/>
                 <w:webHidden/>
               </w:rPr>
-              <w:instrText xml:space="preserve"> PAGEREF _Toc229242275 \h </w:instrText>
+              <w:instrText xml:space="preserve"> PAGEREF _Toc229485417 \h </w:instrText>
             </w:r>
             <w:r>
               <w:rPr>
@@ -3578,7 +3579,7 @@
               <w14:ligatures w14:val="standardContextual"/>
             </w:rPr>
           </w:pPr>
-          <w:hyperlink w:anchor="_Toc229242276" w:history="1">
+          <w:hyperlink w:anchor="_Toc229485418" w:history="1">
             <w:r>
               <w:rPr>
                 <w:rStyle w:val="Hipervnculo"/>
@@ -3605,7 +3606,7 @@
                 <w:noProof/>
                 <w:webHidden/>
               </w:rPr>
-              <w:instrText xml:space="preserve"> PAGEREF _Toc229242276 \h </w:instrText>
+              <w:instrText xml:space="preserve"> PAGEREF _Toc229485418 \h </w:instrText>
             </w:r>
             <w:r>
               <w:rPr>
@@ -3650,7 +3651,7 @@
               <w14:ligatures w14:val="standardContextual"/>
             </w:rPr>
           </w:pPr>
-          <w:hyperlink w:anchor="_Toc229242277" w:history="1">
+          <w:hyperlink w:anchor="_Toc229485419" w:history="1">
             <w:r>
               <w:rPr>
                 <w:rStyle w:val="Hipervnculo"/>
@@ -3677,7 +3678,7 @@
                 <w:noProof/>
                 <w:webHidden/>
               </w:rPr>
-              <w:instrText xml:space="preserve"> PAGEREF _Toc229242277 \h </w:instrText>
+              <w:instrText xml:space="preserve"> PAGEREF _Toc229485419 \h </w:instrText>
             </w:r>
             <w:r>
               <w:rPr>
@@ -3722,7 +3723,7 @@
               <w14:ligatures w14:val="standardContextual"/>
             </w:rPr>
           </w:pPr>
-          <w:hyperlink w:anchor="_Toc229242278" w:history="1">
+          <w:hyperlink w:anchor="_Toc229485420" w:history="1">
             <w:r>
               <w:rPr>
                 <w:rStyle w:val="Hipervnculo"/>
@@ -3749,7 +3750,7 @@
                 <w:noProof/>
                 <w:webHidden/>
               </w:rPr>
-              <w:instrText xml:space="preserve"> PAGEREF _Toc229242278 \h </w:instrText>
+              <w:instrText xml:space="preserve"> PAGEREF _Toc229485420 \h </w:instrText>
             </w:r>
             <w:r>
               <w:rPr>
@@ -3794,7 +3795,7 @@
               <w14:ligatures w14:val="standardContextual"/>
             </w:rPr>
           </w:pPr>
-          <w:hyperlink w:anchor="_Toc229242279" w:history="1">
+          <w:hyperlink w:anchor="_Toc229485421" w:history="1">
             <w:r>
               <w:rPr>
                 <w:rStyle w:val="Hipervnculo"/>
@@ -3821,7 +3822,7 @@
                 <w:noProof/>
                 <w:webHidden/>
               </w:rPr>
-              <w:instrText xml:space="preserve"> PAGEREF _Toc229242279 \h </w:instrText>
+              <w:instrText xml:space="preserve"> PAGEREF _Toc229485421 \h </w:instrText>
             </w:r>
             <w:r>
               <w:rPr>
@@ -3866,7 +3867,7 @@
               <w14:ligatures w14:val="standardContextual"/>
             </w:rPr>
           </w:pPr>
-          <w:hyperlink w:anchor="_Toc229242280" w:history="1">
+          <w:hyperlink w:anchor="_Toc229485422" w:history="1">
             <w:r>
               <w:rPr>
                 <w:rStyle w:val="Hipervnculo"/>
@@ -3893,7 +3894,7 @@
                 <w:noProof/>
                 <w:webHidden/>
               </w:rPr>
-              <w:instrText xml:space="preserve"> PAGEREF _Toc229242280 \h </w:instrText>
+              <w:instrText xml:space="preserve"> PAGEREF _Toc229485422 \h </w:instrText>
             </w:r>
             <w:r>
               <w:rPr>
@@ -3938,7 +3939,7 @@
               <w14:ligatures w14:val="standardContextual"/>
             </w:rPr>
           </w:pPr>
-          <w:hyperlink w:anchor="_Toc229242281" w:history="1">
+          <w:hyperlink w:anchor="_Toc229485423" w:history="1">
             <w:r>
               <w:rPr>
                 <w:rStyle w:val="Hipervnculo"/>
@@ -3965,7 +3966,7 @@
                 <w:noProof/>
                 <w:webHidden/>
               </w:rPr>
-              <w:instrText xml:space="preserve"> PAGEREF _Toc229242281 \h </w:instrText>
+              <w:instrText xml:space="preserve"> PAGEREF _Toc229485423 \h </w:instrText>
             </w:r>
             <w:r>
               <w:rPr>
@@ -4010,7 +4011,7 @@
               <w14:ligatures w14:val="standardContextual"/>
             </w:rPr>
           </w:pPr>
-          <w:hyperlink w:anchor="_Toc229242282" w:history="1">
+          <w:hyperlink w:anchor="_Toc229485424" w:history="1">
             <w:r>
               <w:rPr>
                 <w:rStyle w:val="Hipervnculo"/>
@@ -4037,7 +4038,7 @@
                 <w:noProof/>
                 <w:webHidden/>
               </w:rPr>
-              <w:instrText xml:space="preserve"> PAGEREF _Toc229242282 \h </w:instrText>
+              <w:instrText xml:space="preserve"> PAGEREF _Toc229485424 \h </w:instrText>
             </w:r>
             <w:r>
               <w:rPr>
@@ -4082,7 +4083,7 @@
               <w14:ligatures w14:val="standardContextual"/>
             </w:rPr>
           </w:pPr>
-          <w:hyperlink w:anchor="_Toc229242283" w:history="1">
+          <w:hyperlink w:anchor="_Toc229485425" w:history="1">
             <w:r>
               <w:rPr>
                 <w:rStyle w:val="Hipervnculo"/>
@@ -4109,7 +4110,7 @@
                 <w:noProof/>
                 <w:webHidden/>
               </w:rPr>
-              <w:instrText xml:space="preserve"> PAGEREF _Toc229242283 \h </w:instrText>
+              <w:instrText xml:space="preserve"> PAGEREF _Toc229485425 \h </w:instrText>
             </w:r>
             <w:r>
               <w:rPr>
@@ -4154,7 +4155,7 @@
               <w14:ligatures w14:val="standardContextual"/>
             </w:rPr>
           </w:pPr>
-          <w:hyperlink w:anchor="_Toc229242284" w:history="1">
+          <w:hyperlink w:anchor="_Toc229485426" w:history="1">
             <w:r>
               <w:rPr>
                 <w:rStyle w:val="Hipervnculo"/>
@@ -4181,7 +4182,7 @@
                 <w:noProof/>
                 <w:webHidden/>
               </w:rPr>
-              <w:instrText xml:space="preserve"> PAGEREF _Toc229242284 \h </w:instrText>
+              <w:instrText xml:space="preserve"> PAGEREF _Toc229485426 \h </w:instrText>
             </w:r>
             <w:r>
               <w:rPr>
@@ -4226,7 +4227,7 @@
               <w14:ligatures w14:val="standardContextual"/>
             </w:rPr>
           </w:pPr>
-          <w:hyperlink w:anchor="_Toc229242285" w:history="1">
+          <w:hyperlink w:anchor="_Toc229485427" w:history="1">
             <w:r>
               <w:rPr>
                 <w:rStyle w:val="Hipervnculo"/>
@@ -4253,7 +4254,7 @@
                 <w:noProof/>
                 <w:webHidden/>
               </w:rPr>
-              <w:instrText xml:space="preserve"> PAGEREF _Toc229242285 \h </w:instrText>
+              <w:instrText xml:space="preserve"> PAGEREF _Toc229485427 \h </w:instrText>
             </w:r>
             <w:r>
               <w:rPr>
@@ -4298,7 +4299,7 @@
               <w14:ligatures w14:val="standardContextual"/>
             </w:rPr>
           </w:pPr>
-          <w:hyperlink w:anchor="_Toc229242286" w:history="1">
+          <w:hyperlink w:anchor="_Toc229485428" w:history="1">
             <w:r>
               <w:rPr>
                 <w:rStyle w:val="Hipervnculo"/>
@@ -4325,7 +4326,7 @@
                 <w:noProof/>
                 <w:webHidden/>
               </w:rPr>
-              <w:instrText xml:space="preserve"> PAGEREF _Toc229242286 \h </w:instrText>
+              <w:instrText xml:space="preserve"> PAGEREF _Toc229485428 \h </w:instrText>
             </w:r>
             <w:r>
               <w:rPr>
@@ -4370,7 +4371,7 @@
               <w14:ligatures w14:val="standardContextual"/>
             </w:rPr>
           </w:pPr>
-          <w:hyperlink w:anchor="_Toc229242287" w:history="1">
+          <w:hyperlink w:anchor="_Toc229485429" w:history="1">
             <w:r>
               <w:rPr>
                 <w:rStyle w:val="Hipervnculo"/>
@@ -4397,7 +4398,7 @@
                 <w:noProof/>
                 <w:webHidden/>
               </w:rPr>
-              <w:instrText xml:space="preserve"> PAGEREF _Toc229242287 \h </w:instrText>
+              <w:instrText xml:space="preserve"> PAGEREF _Toc229485429 \h </w:instrText>
             </w:r>
             <w:r>
               <w:rPr>
@@ -4442,7 +4443,7 @@
               <w14:ligatures w14:val="standardContextual"/>
             </w:rPr>
           </w:pPr>
-          <w:hyperlink w:anchor="_Toc229242288" w:history="1">
+          <w:hyperlink w:anchor="_Toc229485430" w:history="1">
             <w:r>
               <w:rPr>
                 <w:rStyle w:val="Hipervnculo"/>
@@ -4469,7 +4470,7 @@
                 <w:noProof/>
                 <w:webHidden/>
               </w:rPr>
-              <w:instrText xml:space="preserve"> PAGEREF _Toc229242288 \h </w:instrText>
+              <w:instrText xml:space="preserve"> PAGEREF _Toc229485430 \h </w:instrText>
             </w:r>
             <w:r>
               <w:rPr>
@@ -4514,7 +4515,7 @@
               <w14:ligatures w14:val="standardContextual"/>
             </w:rPr>
           </w:pPr>
-          <w:hyperlink w:anchor="_Toc229242289" w:history="1">
+          <w:hyperlink w:anchor="_Toc229485431" w:history="1">
             <w:r>
               <w:rPr>
                 <w:rStyle w:val="Hipervnculo"/>
@@ -4541,7 +4542,7 @@
                 <w:noProof/>
                 <w:webHidden/>
               </w:rPr>
-              <w:instrText xml:space="preserve"> PAGEREF _Toc229242289 \h </w:instrText>
+              <w:instrText xml:space="preserve"> PAGEREF _Toc229485431 \h </w:instrText>
             </w:r>
             <w:r>
               <w:rPr>
@@ -4586,7 +4587,7 @@
               <w14:ligatures w14:val="standardContextual"/>
             </w:rPr>
           </w:pPr>
-          <w:hyperlink w:anchor="_Toc229242290" w:history="1">
+          <w:hyperlink w:anchor="_Toc229485432" w:history="1">
             <w:r>
               <w:rPr>
                 <w:rStyle w:val="Hipervnculo"/>
@@ -4613,7 +4614,7 @@
                 <w:noProof/>
                 <w:webHidden/>
               </w:rPr>
-              <w:instrText xml:space="preserve"> PAGEREF _Toc229242290 \h </w:instrText>
+              <w:instrText xml:space="preserve"> PAGEREF _Toc229485432 \h </w:instrText>
             </w:r>
             <w:r>
               <w:rPr>
@@ -4658,7 +4659,7 @@
               <w14:ligatures w14:val="standardContextual"/>
             </w:rPr>
           </w:pPr>
-          <w:hyperlink w:anchor="_Toc229242291" w:history="1">
+          <w:hyperlink w:anchor="_Toc229485433" w:history="1">
             <w:r>
               <w:rPr>
                 <w:rStyle w:val="Hipervnculo"/>
@@ -4685,7 +4686,7 @@
                 <w:noProof/>
                 <w:webHidden/>
               </w:rPr>
-              <w:instrText xml:space="preserve"> PAGEREF _Toc229242291 \h </w:instrText>
+              <w:instrText xml:space="preserve"> PAGEREF _Toc229485433 \h </w:instrText>
             </w:r>
             <w:r>
               <w:rPr>
@@ -4730,7 +4731,7 @@
               <w14:ligatures w14:val="standardContextual"/>
             </w:rPr>
           </w:pPr>
-          <w:hyperlink w:anchor="_Toc229242292" w:history="1">
+          <w:hyperlink w:anchor="_Toc229485434" w:history="1">
             <w:r>
               <w:rPr>
                 <w:rStyle w:val="Hipervnculo"/>
@@ -4757,7 +4758,7 @@
                 <w:noProof/>
                 <w:webHidden/>
               </w:rPr>
-              <w:instrText xml:space="preserve"> PAGEREF _Toc229242292 \h </w:instrText>
+              <w:instrText xml:space="preserve"> PAGEREF _Toc229485434 \h </w:instrText>
             </w:r>
             <w:r>
               <w:rPr>
@@ -4802,7 +4803,7 @@
               <w14:ligatures w14:val="standardContextual"/>
             </w:rPr>
           </w:pPr>
-          <w:hyperlink w:anchor="_Toc229242293" w:history="1">
+          <w:hyperlink w:anchor="_Toc229485435" w:history="1">
             <w:r>
               <w:rPr>
                 <w:rStyle w:val="Hipervnculo"/>
@@ -4829,7 +4830,7 @@
                 <w:noProof/>
                 <w:webHidden/>
               </w:rPr>
-              <w:instrText xml:space="preserve"> PAGEREF _Toc229242293 \h </w:instrText>
+              <w:instrText xml:space="preserve"> PAGEREF _Toc229485435 \h </w:instrText>
             </w:r>
             <w:r>
               <w:rPr>
@@ -4874,7 +4875,7 @@
               <w14:ligatures w14:val="standardContextual"/>
             </w:rPr>
           </w:pPr>
-          <w:hyperlink w:anchor="_Toc229242294" w:history="1">
+          <w:hyperlink w:anchor="_Toc229485436" w:history="1">
             <w:r>
               <w:rPr>
                 <w:rStyle w:val="Hipervnculo"/>
@@ -4901,7 +4902,7 @@
                 <w:noProof/>
                 <w:webHidden/>
               </w:rPr>
-              <w:instrText xml:space="preserve"> PAGEREF _Toc229242294 \h </w:instrText>
+              <w:instrText xml:space="preserve"> PAGEREF _Toc229485436 \h </w:instrText>
             </w:r>
             <w:r>
               <w:rPr>
@@ -4946,7 +4947,7 @@
               <w14:ligatures w14:val="standardContextual"/>
             </w:rPr>
           </w:pPr>
-          <w:hyperlink w:anchor="_Toc229242295" w:history="1">
+          <w:hyperlink w:anchor="_Toc229485437" w:history="1">
             <w:r>
               <w:rPr>
                 <w:rStyle w:val="Hipervnculo"/>
@@ -4973,7 +4974,7 @@
                 <w:noProof/>
                 <w:webHidden/>
               </w:rPr>
-              <w:instrText xml:space="preserve"> PAGEREF _Toc229242295 \h </w:instrText>
+              <w:instrText xml:space="preserve"> PAGEREF _Toc229485437 \h </w:instrText>
             </w:r>
             <w:r>
               <w:rPr>
@@ -5018,7 +5019,7 @@
               <w14:ligatures w14:val="standardContextual"/>
             </w:rPr>
           </w:pPr>
-          <w:hyperlink w:anchor="_Toc229242296" w:history="1">
+          <w:hyperlink w:anchor="_Toc229485438" w:history="1">
             <w:r>
               <w:rPr>
                 <w:rStyle w:val="Hipervnculo"/>
@@ -5045,7 +5046,7 @@
                 <w:noProof/>
                 <w:webHidden/>
               </w:rPr>
-              <w:instrText xml:space="preserve"> PAGEREF _Toc229242296 \h </w:instrText>
+              <w:instrText xml:space="preserve"> PAGEREF _Toc229485438 \h </w:instrText>
             </w:r>
             <w:r>
               <w:rPr>
@@ -5090,7 +5091,7 @@
               <w14:ligatures w14:val="standardContextual"/>
             </w:rPr>
           </w:pPr>
-          <w:hyperlink w:anchor="_Toc229242297" w:history="1">
+          <w:hyperlink w:anchor="_Toc229485439" w:history="1">
             <w:r>
               <w:rPr>
                 <w:rStyle w:val="Hipervnculo"/>
@@ -5117,7 +5118,7 @@
                 <w:noProof/>
                 <w:webHidden/>
               </w:rPr>
-              <w:instrText xml:space="preserve"> PAGEREF _Toc229242297 \h </w:instrText>
+              <w:instrText xml:space="preserve"> PAGEREF _Toc229485439 \h </w:instrText>
             </w:r>
             <w:r>
               <w:rPr>
@@ -5162,7 +5163,7 @@
               <w14:ligatures w14:val="standardContextual"/>
             </w:rPr>
           </w:pPr>
-          <w:hyperlink w:anchor="_Toc229242298" w:history="1">
+          <w:hyperlink w:anchor="_Toc229485440" w:history="1">
             <w:r>
               <w:rPr>
                 <w:rStyle w:val="Hipervnculo"/>
@@ -5189,7 +5190,7 @@
                 <w:noProof/>
                 <w:webHidden/>
               </w:rPr>
-              <w:instrText xml:space="preserve"> PAGEREF _Toc229242298 \h </w:instrText>
+              <w:instrText xml:space="preserve"> PAGEREF _Toc229485440 \h </w:instrText>
             </w:r>
             <w:r>
               <w:rPr>
@@ -5234,7 +5235,7 @@
               <w14:ligatures w14:val="standardContextual"/>
             </w:rPr>
           </w:pPr>
-          <w:hyperlink w:anchor="_Toc229242299" w:history="1">
+          <w:hyperlink w:anchor="_Toc229485441" w:history="1">
             <w:r>
               <w:rPr>
                 <w:rStyle w:val="Hipervnculo"/>
@@ -5261,7 +5262,7 @@
                 <w:noProof/>
                 <w:webHidden/>
               </w:rPr>
-              <w:instrText xml:space="preserve"> PAGEREF _Toc229242299 \h </w:instrText>
+              <w:instrText xml:space="preserve"> PAGEREF _Toc229485441 \h </w:instrText>
             </w:r>
             <w:r>
               <w:rPr>
@@ -5306,7 +5307,7 @@
               <w14:ligatures w14:val="standardContextual"/>
             </w:rPr>
           </w:pPr>
-          <w:hyperlink w:anchor="_Toc229242300" w:history="1">
+          <w:hyperlink w:anchor="_Toc229485442" w:history="1">
             <w:r>
               <w:rPr>
                 <w:rStyle w:val="Hipervnculo"/>
@@ -5333,7 +5334,7 @@
                 <w:noProof/>
                 <w:webHidden/>
               </w:rPr>
-              <w:instrText xml:space="preserve"> PAGEREF _Toc229242300 \h </w:instrText>
+              <w:instrText xml:space="preserve"> PAGEREF _Toc229485442 \h </w:instrText>
             </w:r>
             <w:r>
               <w:rPr>
@@ -5378,7 +5379,7 @@
               <w14:ligatures w14:val="standardContextual"/>
             </w:rPr>
           </w:pPr>
-          <w:hyperlink w:anchor="_Toc229242301" w:history="1">
+          <w:hyperlink w:anchor="_Toc229485443" w:history="1">
             <w:r>
               <w:rPr>
                 <w:rStyle w:val="Hipervnculo"/>
@@ -5405,7 +5406,7 @@
                 <w:noProof/>
                 <w:webHidden/>
               </w:rPr>
-              <w:instrText xml:space="preserve"> PAGEREF _Toc229242301 \h </w:instrText>
+              <w:instrText xml:space="preserve"> PAGEREF _Toc229485443 \h </w:instrText>
             </w:r>
             <w:r>
               <w:rPr>
@@ -5450,7 +5451,7 @@
               <w14:ligatures w14:val="standardContextual"/>
             </w:rPr>
           </w:pPr>
-          <w:hyperlink w:anchor="_Toc229242302" w:history="1">
+          <w:hyperlink w:anchor="_Toc229485444" w:history="1">
             <w:r>
               <w:rPr>
                 <w:rStyle w:val="Hipervnculo"/>
@@ -5477,7 +5478,7 @@
                 <w:noProof/>
                 <w:webHidden/>
               </w:rPr>
-              <w:instrText xml:space="preserve"> PAGEREF _Toc229242302 \h </w:instrText>
+              <w:instrText xml:space="preserve"> PAGEREF _Toc229485444 \h </w:instrText>
             </w:r>
             <w:r>
               <w:rPr>
@@ -5522,7 +5523,7 @@
               <w14:ligatures w14:val="standardContextual"/>
             </w:rPr>
           </w:pPr>
-          <w:hyperlink w:anchor="_Toc229242303" w:history="1">
+          <w:hyperlink w:anchor="_Toc229485445" w:history="1">
             <w:r>
               <w:rPr>
                 <w:rStyle w:val="Hipervnculo"/>
@@ -5549,7 +5550,7 @@
                 <w:noProof/>
                 <w:webHidden/>
               </w:rPr>
-              <w:instrText xml:space="preserve"> PAGEREF _Toc229242303 \h </w:instrText>
+              <w:instrText xml:space="preserve"> PAGEREF _Toc229485445 \h </w:instrText>
             </w:r>
             <w:r>
               <w:rPr>
@@ -5594,7 +5595,7 @@
               <w14:ligatures w14:val="standardContextual"/>
             </w:rPr>
           </w:pPr>
-          <w:hyperlink w:anchor="_Toc229242304" w:history="1">
+          <w:hyperlink w:anchor="_Toc229485446" w:history="1">
             <w:r>
               <w:rPr>
                 <w:rStyle w:val="Hipervnculo"/>
@@ -5621,7 +5622,7 @@
                 <w:noProof/>
                 <w:webHidden/>
               </w:rPr>
-              <w:instrText xml:space="preserve"> PAGEREF _Toc229242304 \h </w:instrText>
+              <w:instrText xml:space="preserve"> PAGEREF _Toc229485446 \h </w:instrText>
             </w:r>
             <w:r>
               <w:rPr>
@@ -5666,7 +5667,7 @@
               <w14:ligatures w14:val="standardContextual"/>
             </w:rPr>
           </w:pPr>
-          <w:hyperlink w:anchor="_Toc229242305" w:history="1">
+          <w:hyperlink w:anchor="_Toc229485447" w:history="1">
             <w:r>
               <w:rPr>
                 <w:rStyle w:val="Hipervnculo"/>
@@ -5694,7 +5695,7 @@
                 <w:noProof/>
                 <w:webHidden/>
               </w:rPr>
-              <w:instrText xml:space="preserve"> PAGEREF _Toc229242305 \h </w:instrText>
+              <w:instrText xml:space="preserve"> PAGEREF _Toc229485447 \h </w:instrText>
             </w:r>
             <w:r>
               <w:rPr>
@@ -5739,7 +5740,7 @@
               <w14:ligatures w14:val="standardContextual"/>
             </w:rPr>
           </w:pPr>
-          <w:hyperlink w:anchor="_Toc229242306" w:history="1">
+          <w:hyperlink w:anchor="_Toc229485448" w:history="1">
             <w:r>
               <w:rPr>
                 <w:rStyle w:val="Hipervnculo"/>
@@ -5766,7 +5767,7 @@
                 <w:noProof/>
                 <w:webHidden/>
               </w:rPr>
-              <w:instrText xml:space="preserve"> PAGEREF _Toc229242306 \h </w:instrText>
+              <w:instrText xml:space="preserve"> PAGEREF _Toc229485448 \h </w:instrText>
             </w:r>
             <w:r>
               <w:rPr>
@@ -5811,7 +5812,7 @@
               <w14:ligatures w14:val="standardContextual"/>
             </w:rPr>
           </w:pPr>
-          <w:hyperlink w:anchor="_Toc229242307" w:history="1">
+          <w:hyperlink w:anchor="_Toc229485449" w:history="1">
             <w:r>
               <w:rPr>
                 <w:rStyle w:val="Hipervnculo"/>
@@ -5838,7 +5839,7 @@
                 <w:noProof/>
                 <w:webHidden/>
               </w:rPr>
-              <w:instrText xml:space="preserve"> PAGEREF _Toc229242307 \h </w:instrText>
+              <w:instrText xml:space="preserve"> PAGEREF _Toc229485449 \h </w:instrText>
             </w:r>
             <w:r>
               <w:rPr>
@@ -5883,7 +5884,7 @@
               <w14:ligatures w14:val="standardContextual"/>
             </w:rPr>
           </w:pPr>
-          <w:hyperlink w:anchor="_Toc229242308" w:history="1">
+          <w:hyperlink w:anchor="_Toc229485450" w:history="1">
             <w:r>
               <w:rPr>
                 <w:rStyle w:val="Hipervnculo"/>
@@ -5910,7 +5911,7 @@
                 <w:noProof/>
                 <w:webHidden/>
               </w:rPr>
-              <w:instrText xml:space="preserve"> PAGEREF _Toc229242308 \h </w:instrText>
+              <w:instrText xml:space="preserve"> PAGEREF _Toc229485450 \h </w:instrText>
             </w:r>
             <w:r>
               <w:rPr>
@@ -5955,7 +5956,7 @@
               <w14:ligatures w14:val="standardContextual"/>
             </w:rPr>
           </w:pPr>
-          <w:hyperlink w:anchor="_Toc229242309" w:history="1">
+          <w:hyperlink w:anchor="_Toc229485451" w:history="1">
             <w:r>
               <w:rPr>
                 <w:rStyle w:val="Hipervnculo"/>
@@ -5982,7 +5983,7 @@
                 <w:noProof/>
                 <w:webHidden/>
               </w:rPr>
-              <w:instrText xml:space="preserve"> PAGEREF _Toc229242309 \h </w:instrText>
+              <w:instrText xml:space="preserve"> PAGEREF _Toc229485451 \h </w:instrText>
             </w:r>
             <w:r>
               <w:rPr>
@@ -6027,7 +6028,7 @@
               <w14:ligatures w14:val="standardContextual"/>
             </w:rPr>
           </w:pPr>
-          <w:hyperlink w:anchor="_Toc229242310" w:history="1">
+          <w:hyperlink w:anchor="_Toc229485452" w:history="1">
             <w:r>
               <w:rPr>
                 <w:rStyle w:val="Hipervnculo"/>
@@ -6054,7 +6055,7 @@
                 <w:noProof/>
                 <w:webHidden/>
               </w:rPr>
-              <w:instrText xml:space="preserve"> PAGEREF _Toc229242310 \h </w:instrText>
+              <w:instrText xml:space="preserve"> PAGEREF _Toc229485452 \h </w:instrText>
             </w:r>
             <w:r>
               <w:rPr>
@@ -6099,7 +6100,7 @@
               <w14:ligatures w14:val="standardContextual"/>
             </w:rPr>
           </w:pPr>
-          <w:hyperlink w:anchor="_Toc229242311" w:history="1">
+          <w:hyperlink w:anchor="_Toc229485453" w:history="1">
             <w:r>
               <w:rPr>
                 <w:rStyle w:val="Hipervnculo"/>
@@ -6126,7 +6127,7 @@
                 <w:noProof/>
                 <w:webHidden/>
               </w:rPr>
-              <w:instrText xml:space="preserve"> PAGEREF _Toc229242311 \h </w:instrText>
+              <w:instrText xml:space="preserve"> PAGEREF _Toc229485453 \h </w:instrText>
             </w:r>
             <w:r>
               <w:rPr>
@@ -6171,7 +6172,7 @@
               <w14:ligatures w14:val="standardContextual"/>
             </w:rPr>
           </w:pPr>
-          <w:hyperlink w:anchor="_Toc229242312" w:history="1">
+          <w:hyperlink w:anchor="_Toc229485454" w:history="1">
             <w:r>
               <w:rPr>
                 <w:rStyle w:val="Hipervnculo"/>
@@ -6198,7 +6199,7 @@
                 <w:noProof/>
                 <w:webHidden/>
               </w:rPr>
-              <w:instrText xml:space="preserve"> PAGEREF _Toc229242312 \h </w:instrText>
+              <w:instrText xml:space="preserve"> PAGEREF _Toc229485454 \h </w:instrText>
             </w:r>
             <w:r>
               <w:rPr>
@@ -6243,7 +6244,7 @@
               <w14:ligatures w14:val="standardContextual"/>
             </w:rPr>
           </w:pPr>
-          <w:hyperlink w:anchor="_Toc229242313" w:history="1">
+          <w:hyperlink w:anchor="_Toc229485455" w:history="1">
             <w:r>
               <w:rPr>
                 <w:rStyle w:val="Hipervnculo"/>
@@ -6270,7 +6271,7 @@
                 <w:noProof/>
                 <w:webHidden/>
               </w:rPr>
-              <w:instrText xml:space="preserve"> PAGEREF _Toc229242313 \h </w:instrText>
+              <w:instrText xml:space="preserve"> PAGEREF _Toc229485455 \h </w:instrText>
             </w:r>
             <w:r>
               <w:rPr>
@@ -6315,7 +6316,7 @@
               <w14:ligatures w14:val="standardContextual"/>
             </w:rPr>
           </w:pPr>
-          <w:hyperlink w:anchor="_Toc229242314" w:history="1">
+          <w:hyperlink w:anchor="_Toc229485456" w:history="1">
             <w:r>
               <w:rPr>
                 <w:rStyle w:val="Hipervnculo"/>
@@ -6342,7 +6343,7 @@
                 <w:noProof/>
                 <w:webHidden/>
               </w:rPr>
-              <w:instrText xml:space="preserve"> PAGEREF _Toc229242314 \h </w:instrText>
+              <w:instrText xml:space="preserve"> PAGEREF _Toc229485456 \h </w:instrText>
             </w:r>
             <w:r>
               <w:rPr>
@@ -6387,7 +6388,7 @@
               <w14:ligatures w14:val="standardContextual"/>
             </w:rPr>
           </w:pPr>
-          <w:hyperlink w:anchor="_Toc229242315" w:history="1">
+          <w:hyperlink w:anchor="_Toc229485457" w:history="1">
             <w:r>
               <w:rPr>
                 <w:rStyle w:val="Hipervnculo"/>
@@ -6414,7 +6415,7 @@
                 <w:noProof/>
                 <w:webHidden/>
               </w:rPr>
-              <w:instrText xml:space="preserve"> PAGEREF _Toc229242315 \h </w:instrText>
+              <w:instrText xml:space="preserve"> PAGEREF _Toc229485457 \h </w:instrText>
             </w:r>
             <w:r>
               <w:rPr>
@@ -6472,7 +6473,7 @@
       <w:pPr>
         <w:pStyle w:val="Ttulo1"/>
       </w:pPr>
-      <w:bookmarkStart w:id="1" w:name="_Toc229242233"/>
+      <w:bookmarkStart w:id="1" w:name="_Toc229485375"/>
       <w:r>
         <w:lastRenderedPageBreak/>
         <w:t>ESPECIFICACIÓN FUNCIONAL - TRANSPORTES GENESIS</w:t>
@@ -6484,7 +6485,7 @@
         <w:pStyle w:val="Ttulo2"/>
       </w:pPr>
       <w:bookmarkStart w:id="2" w:name="sistema-de-gestión-de-transporte-escolar"/>
-      <w:bookmarkStart w:id="3" w:name="_Toc229242234"/>
+      <w:bookmarkStart w:id="3" w:name="_Toc229485376"/>
       <w:r>
         <w:t>Sistema de Gestión de Transporte Escolar</w:t>
       </w:r>
@@ -6605,7 +6606,7 @@
         <w:pStyle w:val="Ttulo2"/>
       </w:pPr>
       <w:bookmarkStart w:id="4" w:name="introducción-y-alcance-del-sistema"/>
-      <w:bookmarkStart w:id="5" w:name="_Toc229242235"/>
+      <w:bookmarkStart w:id="5" w:name="_Toc229485377"/>
       <w:bookmarkEnd w:id="2"/>
       <w:r>
         <w:t>1.1 Introducción y alcance del sistema</w:t>
@@ -6617,7 +6618,7 @@
         <w:pStyle w:val="Ttulo3"/>
       </w:pPr>
       <w:bookmarkStart w:id="6" w:name="descripción-general"/>
-      <w:bookmarkStart w:id="7" w:name="_Toc229242236"/>
+      <w:bookmarkStart w:id="7" w:name="_Toc229485378"/>
       <w:r>
         <w:t>1.1.1 Descripción General</w:t>
       </w:r>
@@ -6636,7 +6637,7 @@
         <w:pStyle w:val="Ttulo3"/>
       </w:pPr>
       <w:bookmarkStart w:id="8" w:name="problema-que-resuelve"/>
-      <w:bookmarkStart w:id="9" w:name="_Toc229242237"/>
+      <w:bookmarkStart w:id="9" w:name="_Toc229485379"/>
       <w:bookmarkEnd w:id="6"/>
       <w:r>
         <w:t>1.1.2 Problema que Resuelve</w:t>
@@ -6809,7 +6810,7 @@
         <w:pStyle w:val="Ttulo3"/>
       </w:pPr>
       <w:bookmarkStart w:id="10" w:name="objetivos-del-proyecto"/>
-      <w:bookmarkStart w:id="11" w:name="_Toc229242238"/>
+      <w:bookmarkStart w:id="11" w:name="_Toc229485380"/>
       <w:bookmarkEnd w:id="8"/>
       <w:r>
         <w:lastRenderedPageBreak/>
@@ -7043,7 +7044,7 @@
         </w:rPr>
       </w:pPr>
       <w:bookmarkStart w:id="14" w:name="alcance-del-sistema"/>
-      <w:bookmarkStart w:id="15" w:name="_Toc229242239"/>
+      <w:bookmarkStart w:id="15" w:name="_Toc229485381"/>
       <w:bookmarkEnd w:id="10"/>
       <w:bookmarkEnd w:id="13"/>
       <w:r>
@@ -7804,7 +7805,16 @@
         </w:numPr>
       </w:pPr>
       <w:r>
-        <w:t>Los pagos se registran manualmente (no hay integración con Stripe, PayPal, etc.)</w:t>
+        <w:t xml:space="preserve">Los pagos se registran manualmente </w:t>
+      </w:r>
+      <w:r>
+        <w:t xml:space="preserve"> y  </w:t>
+      </w:r>
+      <w:r>
+        <w:t>hay integración con Stripe</w:t>
+      </w:r>
+      <w:r>
+        <w:t>.</w:t>
       </w:r>
     </w:p>
     <w:p>
@@ -8038,7 +8048,7 @@
         <w:pStyle w:val="Ttulo3"/>
       </w:pPr>
       <w:bookmarkStart w:id="18" w:name="beneficios-esperados"/>
-      <w:bookmarkStart w:id="19" w:name="_Toc229242240"/>
+      <w:bookmarkStart w:id="19" w:name="_Toc229485382"/>
       <w:bookmarkEnd w:id="14"/>
       <w:bookmarkEnd w:id="17"/>
       <w:r>
@@ -8277,7 +8287,7 @@
         <w:pStyle w:val="Ttulo3"/>
       </w:pPr>
       <w:bookmarkStart w:id="24" w:name="usuarios-del-sistema"/>
-      <w:bookmarkStart w:id="25" w:name="_Toc229242241"/>
+      <w:bookmarkStart w:id="25" w:name="_Toc229485383"/>
       <w:bookmarkEnd w:id="18"/>
       <w:bookmarkEnd w:id="23"/>
       <w:r>
@@ -8648,7 +8658,7 @@
         <w:pStyle w:val="Ttulo2"/>
       </w:pPr>
       <w:bookmarkStart w:id="26" w:name="contexto-organizacional-y-stakeholders"/>
-      <w:bookmarkStart w:id="27" w:name="_Toc229242242"/>
+      <w:bookmarkStart w:id="27" w:name="_Toc229485384"/>
       <w:bookmarkEnd w:id="4"/>
       <w:bookmarkEnd w:id="24"/>
       <w:r>
@@ -8661,7 +8671,7 @@
         <w:pStyle w:val="Ttulo3"/>
       </w:pPr>
       <w:bookmarkStart w:id="28" w:name="Xe9de658377bead1c64fe906ca4a4f6c4b343d72"/>
-      <w:bookmarkStart w:id="29" w:name="_Toc229242243"/>
+      <w:bookmarkStart w:id="29" w:name="_Toc229485385"/>
       <w:r>
         <w:t>1.2.1 Modelo Organizacional de Empresa de Transporte Escolar</w:t>
       </w:r>
@@ -8892,7 +8902,7 @@
         <w:pStyle w:val="Ttulo3"/>
       </w:pPr>
       <w:bookmarkStart w:id="30" w:name="stakeholders-del-proyecto"/>
-      <w:bookmarkStart w:id="31" w:name="_Toc229242244"/>
+      <w:bookmarkStart w:id="31" w:name="_Toc229485386"/>
       <w:bookmarkEnd w:id="28"/>
       <w:r>
         <w:t>1.2.2 Stakeholders del Proyecto</w:t>
@@ -9754,7 +9764,7 @@
         <w:pStyle w:val="Ttulo3"/>
       </w:pPr>
       <w:bookmarkStart w:id="34" w:name="flujo-operativo-actual-vs-propuesto"/>
-      <w:bookmarkStart w:id="35" w:name="_Toc229242245"/>
+      <w:bookmarkStart w:id="35" w:name="_Toc229485387"/>
       <w:bookmarkEnd w:id="30"/>
       <w:bookmarkEnd w:id="33"/>
       <w:r>
@@ -10778,7 +10788,7 @@
         <w:pStyle w:val="Ttulo3"/>
       </w:pPr>
       <w:bookmarkStart w:id="38" w:name="análisis-de-impacto-en-stakeholders"/>
-      <w:bookmarkStart w:id="39" w:name="_Toc229242246"/>
+      <w:bookmarkStart w:id="39" w:name="_Toc229485388"/>
       <w:bookmarkEnd w:id="34"/>
       <w:bookmarkEnd w:id="37"/>
       <w:r>
@@ -11213,7 +11223,7 @@
         <w:pStyle w:val="Ttulo3"/>
       </w:pPr>
       <w:bookmarkStart w:id="40" w:name="mapa-de-empatía-por-stakeholder"/>
-      <w:bookmarkStart w:id="41" w:name="_Toc229242247"/>
+      <w:bookmarkStart w:id="41" w:name="_Toc229485389"/>
       <w:bookmarkEnd w:id="38"/>
       <w:r>
         <w:t>1.2.5 Mapa de Empatía por Stakeholder</w:t>
@@ -11402,7 +11412,7 @@
         <w:pStyle w:val="Ttulo2"/>
       </w:pPr>
       <w:bookmarkStart w:id="44" w:name="análisis-de-requerimientos-funcionales"/>
-      <w:bookmarkStart w:id="45" w:name="_Toc229242248"/>
+      <w:bookmarkStart w:id="45" w:name="_Toc229485390"/>
       <w:bookmarkEnd w:id="26"/>
       <w:bookmarkEnd w:id="40"/>
       <w:bookmarkEnd w:id="43"/>
@@ -11416,7 +11426,7 @@
         <w:pStyle w:val="Ttulo3"/>
       </w:pPr>
       <w:bookmarkStart w:id="46" w:name="requerimientos-funcionales-por-módulo"/>
-      <w:bookmarkStart w:id="47" w:name="_Toc229242249"/>
+      <w:bookmarkStart w:id="47" w:name="_Toc229485391"/>
       <w:r>
         <w:t>1.3.1 Requerimientos Funcionales por Módulo</w:t>
       </w:r>
@@ -17410,7 +17420,7 @@
         <w:pStyle w:val="Ttulo3"/>
       </w:pPr>
       <w:bookmarkStart w:id="58" w:name="X3238c1c7b54b85d98990c42c0fd1479e0051dbb"/>
-      <w:bookmarkStart w:id="59" w:name="_Toc229242250"/>
+      <w:bookmarkStart w:id="59" w:name="_Toc229485392"/>
       <w:bookmarkEnd w:id="46"/>
       <w:bookmarkEnd w:id="57"/>
       <w:r>
@@ -18823,7 +18833,7 @@
         <w:pStyle w:val="Ttulo2"/>
       </w:pPr>
       <w:bookmarkStart w:id="60" w:name="Xdb0553b0a79807723d9312c5fd12e3136c53021"/>
-      <w:bookmarkStart w:id="61" w:name="_Toc229242251"/>
+      <w:bookmarkStart w:id="61" w:name="_Toc229485393"/>
       <w:bookmarkEnd w:id="44"/>
       <w:bookmarkEnd w:id="58"/>
       <w:r>
@@ -18836,7 +18846,7 @@
         <w:pStyle w:val="Ttulo3"/>
       </w:pPr>
       <w:bookmarkStart w:id="62" w:name="Xe47c84530ce377574d5ec0cde1ecda4233c5523"/>
-      <w:bookmarkStart w:id="63" w:name="_Toc229242252"/>
+      <w:bookmarkStart w:id="63" w:name="_Toc229485394"/>
       <w:r>
         <w:t>1.4.1 Requerimientos de Rendimiento (Performance)</w:t>
       </w:r>
@@ -19397,7 +19407,7 @@
         <w:pStyle w:val="Ttulo3"/>
       </w:pPr>
       <w:bookmarkStart w:id="64" w:name="requerimientos-de-usabilidad"/>
-      <w:bookmarkStart w:id="65" w:name="_Toc229242253"/>
+      <w:bookmarkStart w:id="65" w:name="_Toc229485395"/>
       <w:bookmarkEnd w:id="62"/>
       <w:r>
         <w:t>1.4.2 Requerimientos de Usabilidad</w:t>
@@ -19959,7 +19969,7 @@
         <w:pStyle w:val="Ttulo3"/>
       </w:pPr>
       <w:bookmarkStart w:id="66" w:name="requerimientos-de-seguridad"/>
-      <w:bookmarkStart w:id="67" w:name="_Toc229242254"/>
+      <w:bookmarkStart w:id="67" w:name="_Toc229485396"/>
       <w:bookmarkEnd w:id="64"/>
       <w:r>
         <w:t>1.4.3 Requerimientos de Seguridad</w:t>
@@ -20085,8 +20095,14 @@
           <w:p>
             <w:pPr>
               <w:pStyle w:val="Compact"/>
-            </w:pPr>
-            <w:r>
+              <w:rPr>
+                <w:lang w:val="en-US"/>
+              </w:rPr>
+            </w:pPr>
+            <w:r>
+              <w:rPr>
+                <w:lang w:val="en-US"/>
+              </w:rPr>
               <w:t>ASP.NET Core Identity (bcrypt/PBKDF2)</w:t>
             </w:r>
           </w:p>
@@ -20685,7 +20701,7 @@
         <w:pStyle w:val="Ttulo3"/>
       </w:pPr>
       <w:bookmarkStart w:id="68" w:name="Xfb37b89f3ca5520ccbb11110981e5c52e051d2c"/>
-      <w:bookmarkStart w:id="69" w:name="_Toc229242255"/>
+      <w:bookmarkStart w:id="69" w:name="_Toc229485397"/>
       <w:bookmarkEnd w:id="66"/>
       <w:r>
         <w:lastRenderedPageBreak/>
@@ -21165,7 +21181,7 @@
         <w:pStyle w:val="Ttulo3"/>
       </w:pPr>
       <w:bookmarkStart w:id="70" w:name="requerimientos-de-escalabilidad"/>
-      <w:bookmarkStart w:id="71" w:name="_Toc229242256"/>
+      <w:bookmarkStart w:id="71" w:name="_Toc229485398"/>
       <w:bookmarkEnd w:id="68"/>
       <w:r>
         <w:t>1.4.5 Requerimientos de Escalabilidad</w:t>
@@ -21596,7 +21612,7 @@
         <w:pStyle w:val="Ttulo3"/>
       </w:pPr>
       <w:bookmarkStart w:id="72" w:name="requerimientos-de-mantenibilidad"/>
-      <w:bookmarkStart w:id="73" w:name="_Toc229242257"/>
+      <w:bookmarkStart w:id="73" w:name="_Toc229485399"/>
       <w:bookmarkEnd w:id="70"/>
       <w:r>
         <w:t>1.4.6 Requerimientos de Mantenibilidad</w:t>
@@ -21882,8 +21898,14 @@
           <w:p>
             <w:pPr>
               <w:pStyle w:val="Compact"/>
-            </w:pPr>
-            <w:r>
+              <w:rPr>
+                <w:lang w:val="en-US"/>
+              </w:rPr>
+            </w:pPr>
+            <w:r>
+              <w:rPr>
+                <w:lang w:val="en-US"/>
+              </w:rPr>
               <w:t>Serilog o Azure Application Insights</w:t>
             </w:r>
           </w:p>
@@ -22091,7 +22113,7 @@
         <w:pStyle w:val="Ttulo3"/>
       </w:pPr>
       <w:bookmarkStart w:id="74" w:name="requerimientos-de-compatibilidad"/>
-      <w:bookmarkStart w:id="75" w:name="_Toc229242258"/>
+      <w:bookmarkStart w:id="75" w:name="_Toc229485400"/>
       <w:bookmarkEnd w:id="72"/>
       <w:r>
         <w:t>1.4.7 Requerimientos de Compatibilidad</w:t>
@@ -22438,7 +22460,7 @@
         <w:pStyle w:val="Ttulo3"/>
       </w:pPr>
       <w:bookmarkStart w:id="76" w:name="requerimientos-de-cumplimiento-legal"/>
-      <w:bookmarkStart w:id="77" w:name="_Toc229242259"/>
+      <w:bookmarkStart w:id="77" w:name="_Toc229485401"/>
       <w:bookmarkEnd w:id="74"/>
       <w:r>
         <w:t>1.4.8 Requerimientos de Cumplimiento Legal</w:t>
@@ -22848,7 +22870,7 @@
       <w:pPr>
         <w:pStyle w:val="Ttulo2"/>
       </w:pPr>
-      <w:bookmarkStart w:id="79" w:name="_Toc229242260"/>
+      <w:bookmarkStart w:id="79" w:name="_Toc229485402"/>
       <w:r>
         <w:lastRenderedPageBreak/>
         <w:t>1.5 Análisis de Dominio</w:t>
@@ -22860,7 +22882,7 @@
         <w:pStyle w:val="Ttulo3"/>
       </w:pPr>
       <w:bookmarkStart w:id="80" w:name="modelo-conceptual-del-negocio"/>
-      <w:bookmarkStart w:id="81" w:name="_Toc229242261"/>
+      <w:bookmarkStart w:id="81" w:name="_Toc229485403"/>
       <w:r>
         <w:t>1.5.1 Modelo Conceptual del Negocio</w:t>
       </w:r>
@@ -23693,7 +23715,7 @@
         <w:pStyle w:val="Ttulo3"/>
       </w:pPr>
       <w:bookmarkStart w:id="82" w:name="reglas-de-negocio"/>
-      <w:bookmarkStart w:id="83" w:name="_Toc229242262"/>
+      <w:bookmarkStart w:id="83" w:name="_Toc229485404"/>
       <w:bookmarkEnd w:id="80"/>
       <w:r>
         <w:t>1.5.2 Reglas de Negocio</w:t>
@@ -24736,7 +24758,7 @@
         <w:pStyle w:val="Ttulo3"/>
       </w:pPr>
       <w:bookmarkStart w:id="84" w:name="procesos-de-negocio-clave"/>
-      <w:bookmarkStart w:id="85" w:name="_Toc229242263"/>
+      <w:bookmarkStart w:id="85" w:name="_Toc229485405"/>
       <w:bookmarkEnd w:id="82"/>
       <w:r>
         <w:t>1.5.3 Procesos de Negocio Clave</w:t>
@@ -25842,7 +25864,7 @@
         <w:pStyle w:val="Ttulo3"/>
       </w:pPr>
       <w:bookmarkStart w:id="89" w:name="eventos-de-dominio"/>
-      <w:bookmarkStart w:id="90" w:name="_Toc229242264"/>
+      <w:bookmarkStart w:id="90" w:name="_Toc229485406"/>
       <w:bookmarkEnd w:id="84"/>
       <w:bookmarkEnd w:id="88"/>
       <w:r>
@@ -26407,7 +26429,7 @@
         <w:pStyle w:val="Ttulo2"/>
       </w:pPr>
       <w:bookmarkStart w:id="91" w:name="X4cb074b55f178e0590ecab577f902ed381e3e6d"/>
-      <w:bookmarkStart w:id="92" w:name="_Toc229242265"/>
+      <w:bookmarkStart w:id="92" w:name="_Toc229485407"/>
       <w:bookmarkEnd w:id="78"/>
       <w:bookmarkEnd w:id="89"/>
       <w:r>
@@ -26420,7 +26442,7 @@
         <w:pStyle w:val="Ttulo3"/>
       </w:pPr>
       <w:bookmarkStart w:id="93" w:name="supuestos-del-proyecto"/>
-      <w:bookmarkStart w:id="94" w:name="_Toc229242266"/>
+      <w:bookmarkStart w:id="94" w:name="_Toc229485408"/>
       <w:r>
         <w:t>1.6.1 Supuestos del Proyecto</w:t>
       </w:r>
@@ -27145,7 +27167,7 @@
         <w:pStyle w:val="Ttulo3"/>
       </w:pPr>
       <w:bookmarkStart w:id="95" w:name="restricciones-del-proyecto"/>
-      <w:bookmarkStart w:id="96" w:name="_Toc229242267"/>
+      <w:bookmarkStart w:id="96" w:name="_Toc229485409"/>
       <w:bookmarkEnd w:id="93"/>
       <w:r>
         <w:t>1.6.2 Restricciones del Proyecto</w:t>
@@ -27523,11 +27545,20 @@
           <w:p>
             <w:pPr>
               <w:pStyle w:val="Compact"/>
-            </w:pPr>
-            <w:r>
+              <w:rPr>
+                <w:lang w:val="en-US"/>
+              </w:rPr>
+            </w:pPr>
+            <w:r>
+              <w:rPr>
+                <w:lang w:val="en-US"/>
+              </w:rPr>
               <w:t xml:space="preserve">No se puede usar </w:t>
             </w:r>
             <w:r>
+              <w:rPr>
+                <w:lang w:val="en-US"/>
+              </w:rPr>
               <w:lastRenderedPageBreak/>
               <w:t>polling, long-polling, otros frameworks WebSocket</w:t>
             </w:r>
@@ -28337,7 +28368,7 @@
         <w:pStyle w:val="Ttulo3"/>
       </w:pPr>
       <w:bookmarkStart w:id="101" w:name="dependencias-funcionales"/>
-      <w:bookmarkStart w:id="102" w:name="_Toc229242268"/>
+      <w:bookmarkStart w:id="102" w:name="_Toc229485410"/>
       <w:bookmarkEnd w:id="95"/>
       <w:bookmarkEnd w:id="100"/>
       <w:r>
@@ -29619,7 +29650,7 @@
       <w:pPr>
         <w:pStyle w:val="Ttulo3"/>
       </w:pPr>
-      <w:bookmarkStart w:id="107" w:name="_Toc229242269"/>
+      <w:bookmarkStart w:id="107" w:name="_Toc229485411"/>
       <w:r>
         <w:t>1.6.4 Riesgos Funcionales</w:t>
       </w:r>
@@ -30301,7 +30332,7 @@
       <w:pPr>
         <w:pStyle w:val="Ttulo3"/>
       </w:pPr>
-      <w:bookmarkStart w:id="110" w:name="_Toc229242270"/>
+      <w:bookmarkStart w:id="110" w:name="_Toc229485412"/>
       <w:r>
         <w:lastRenderedPageBreak/>
         <w:t>1.1.5 Usuarios Finales del Sistema</w:t>
@@ -30589,7 +30620,7 @@
         <w:pStyle w:val="Ttulo3"/>
       </w:pPr>
       <w:bookmarkStart w:id="111" w:name="beneficios-esperados-1"/>
-      <w:bookmarkStart w:id="112" w:name="_Toc229242271"/>
+      <w:bookmarkStart w:id="112" w:name="_Toc229485413"/>
       <w:bookmarkEnd w:id="109"/>
       <w:r>
         <w:t>1.1.6 Beneficios Esperados</w:t>
@@ -30902,7 +30933,7 @@
         <w:pStyle w:val="Ttulo1"/>
       </w:pPr>
       <w:bookmarkStart w:id="116" w:name="Xb711ec99459048ba2a840fc03475c38d3b3edcf"/>
-      <w:bookmarkStart w:id="117" w:name="_Toc229242272"/>
+      <w:bookmarkStart w:id="117" w:name="_Toc229485414"/>
       <w:r>
         <w:t>ESPECIFICACIÓN TÉCNICA - TRANSPORTES GENESIS</w:t>
       </w:r>
@@ -30913,7 +30944,7 @@
         <w:pStyle w:val="Ttulo2"/>
       </w:pPr>
       <w:bookmarkStart w:id="118" w:name="arquitectura-de-referencia"/>
-      <w:bookmarkStart w:id="119" w:name="_Toc229242273"/>
+      <w:bookmarkStart w:id="119" w:name="_Toc229485415"/>
       <w:r>
         <w:t>2.1 Arquitectura de referencia</w:t>
       </w:r>
@@ -30924,7 +30955,7 @@
         <w:pStyle w:val="Ttulo3"/>
       </w:pPr>
       <w:bookmarkStart w:id="120" w:name="X6289e5ead93ac7da412ac1f27d83ea408ef3dc0"/>
-      <w:bookmarkStart w:id="121" w:name="_Toc229242274"/>
+      <w:bookmarkStart w:id="121" w:name="_Toc229485416"/>
       <w:r>
         <w:t>2.1.1 Diagrama C4 - Nivel 1: Contexto del Sistema</w:t>
       </w:r>
@@ -31158,8 +31189,8 @@
           <w:noProof/>
         </w:rPr>
         <w:drawing>
-          <wp:inline distT="0" distB="0" distL="0" distR="0" wp14:anchorId="5D0B68C7" wp14:editId="35C6688D">
-            <wp:extent cx="5612130" cy="2307590"/>
+          <wp:inline distT="0" distB="0" distL="0" distR="0" wp14:anchorId="5D0B68C7" wp14:editId="4A369910">
+            <wp:extent cx="6430645" cy="3665220"/>
             <wp:effectExtent l="0" t="0" r="0" b="0"/>
             <wp:docPr id="1799926069" name="Imagen 2"/>
             <wp:cNvGraphicFramePr>
@@ -31190,7 +31221,7 @@
                   <pic:spPr bwMode="auto">
                     <a:xfrm>
                       <a:off x="0" y="0"/>
-                      <a:ext cx="5612130" cy="2307590"/>
+                      <a:ext cx="6439930" cy="3670512"/>
                     </a:xfrm>
                     <a:prstGeom prst="rect">
                       <a:avLst/>
@@ -31213,7 +31244,7 @@
         <w:pStyle w:val="Ttulo3"/>
       </w:pPr>
       <w:bookmarkStart w:id="122" w:name="diagrama-c4---nivel-2-contenedores"/>
-      <w:bookmarkStart w:id="123" w:name="_Toc229242275"/>
+      <w:bookmarkStart w:id="123" w:name="_Toc229485417"/>
       <w:bookmarkEnd w:id="120"/>
       <w:r>
         <w:t>2.1.2 Diagrama C4 - Nivel 2: Contenedores</w:t>
@@ -31393,6 +31424,7 @@
         <w:rPr>
           <w:rStyle w:val="VerbatimChar"/>
         </w:rPr>
+        <w:lastRenderedPageBreak/>
         <w:t>4. "Base de Datos" (SQL Server)</w:t>
       </w:r>
       <w:r>
@@ -31468,7 +31500,6 @@
         <w:rPr>
           <w:rStyle w:val="VerbatimChar"/>
         </w:rPr>
-        <w:lastRenderedPageBreak/>
         <w:t xml:space="preserve">   - Responsabilidad: Renderizado de UI, interacción con usuario</w:t>
       </w:r>
       <w:r>
@@ -31594,8 +31625,8 @@
           <w:noProof/>
         </w:rPr>
         <w:drawing>
-          <wp:inline distT="0" distB="0" distL="0" distR="0" wp14:anchorId="27B75911" wp14:editId="39BB5755">
-            <wp:extent cx="5612130" cy="2412365"/>
+          <wp:inline distT="0" distB="0" distL="0" distR="0" wp14:anchorId="27B75911" wp14:editId="2711BAC5">
+            <wp:extent cx="5612130" cy="3169920"/>
             <wp:effectExtent l="0" t="0" r="0" b="0"/>
             <wp:docPr id="1830666132" name="Imagen 3"/>
             <wp:cNvGraphicFramePr>
@@ -31626,7 +31657,7 @@
                   <pic:spPr bwMode="auto">
                     <a:xfrm>
                       <a:off x="0" y="0"/>
-                      <a:ext cx="5612130" cy="2412365"/>
+                      <a:ext cx="5612130" cy="3169920"/>
                     </a:xfrm>
                     <a:prstGeom prst="rect">
                       <a:avLst/>
@@ -31657,10 +31688,9 @@
         <w:pStyle w:val="Ttulo3"/>
       </w:pPr>
       <w:bookmarkStart w:id="124" w:name="X9da43193f9c4948cf07d13c08eb7247cffc76d8"/>
-      <w:bookmarkStart w:id="125" w:name="_Toc229242276"/>
+      <w:bookmarkStart w:id="125" w:name="_Toc229485418"/>
       <w:bookmarkEnd w:id="122"/>
       <w:r>
-        <w:lastRenderedPageBreak/>
         <w:t>2.1.3 Diagrama C4 - Nivel 3: Componentes (Web Application)</w:t>
       </w:r>
       <w:bookmarkEnd w:id="125"/>
@@ -31937,6 +31967,7 @@
         <w:rPr>
           <w:rStyle w:val="VerbatimChar"/>
         </w:rPr>
+        <w:lastRenderedPageBreak/>
         <w:t>7. "API Controllers" (MVC Controllers)</w:t>
       </w:r>
       <w:r>
@@ -32027,7 +32058,6 @@
         <w:rPr>
           <w:rStyle w:val="VerbatimChar"/>
         </w:rPr>
-        <w:lastRenderedPageBreak/>
         <w:t>10. "Models - Domain"</w:t>
       </w:r>
       <w:r>
@@ -32261,10 +32291,9 @@
         <w:pStyle w:val="Ttulo3"/>
       </w:pPr>
       <w:bookmarkStart w:id="126" w:name="estilo-arquitectónico-y-justificación"/>
-      <w:bookmarkStart w:id="127" w:name="_Toc229242277"/>
+      <w:bookmarkStart w:id="127" w:name="_Toc229485419"/>
       <w:bookmarkEnd w:id="124"/>
       <w:r>
-        <w:lastRenderedPageBreak/>
         <w:t>2.1.4 Estilo Arquitectónico y Justificación</w:t>
       </w:r>
       <w:bookmarkEnd w:id="127"/>
@@ -32618,6 +32647,7 @@
         <w:rPr>
           <w:rStyle w:val="VerbatimChar"/>
         </w:rPr>
+        <w:lastRenderedPageBreak/>
         <w:t xml:space="preserve">                    ↓</w:t>
       </w:r>
       <w:r>
@@ -32682,7 +32712,6 @@
       <w:bookmarkStart w:id="130" w:name="justificación-de-la-arquitectura-elegida"/>
       <w:bookmarkEnd w:id="129"/>
       <w:r>
-        <w:lastRenderedPageBreak/>
         <w:t>Justificación de la Arquitectura Elegida</w:t>
       </w:r>
     </w:p>
@@ -33235,6 +33264,7 @@
                 <w:b/>
                 <w:bCs/>
               </w:rPr>
+              <w:lastRenderedPageBreak/>
               <w:t>Razor Pages + MVC + SignalR</w:t>
             </w:r>
           </w:p>
@@ -33292,11 +33322,10 @@
         <w:pStyle w:val="Ttulo3"/>
       </w:pPr>
       <w:bookmarkStart w:id="131" w:name="diagrama-de-despliegue"/>
-      <w:bookmarkStart w:id="132" w:name="_Toc229242278"/>
+      <w:bookmarkStart w:id="132" w:name="_Toc229485420"/>
       <w:bookmarkEnd w:id="126"/>
       <w:bookmarkEnd w:id="130"/>
       <w:r>
-        <w:lastRenderedPageBreak/>
         <w:t>2.1.5 Diagrama de Despliegue</w:t>
       </w:r>
       <w:bookmarkEnd w:id="132"/>
@@ -33672,6 +33701,7 @@
         <w:rPr>
           <w:rStyle w:val="VerbatimChar"/>
         </w:rPr>
+        <w:lastRenderedPageBreak/>
         <w:t xml:space="preserve">  - Seguridad: TLS 1.2+</w:t>
       </w:r>
       <w:r>
@@ -33732,7 +33762,6 @@
         <w:rPr>
           <w:rStyle w:val="VerbatimChar"/>
         </w:rPr>
-        <w:lastRenderedPageBreak/>
         <w:t xml:space="preserve">  - Conexión: Connection Pooling habilitado</w:t>
       </w:r>
       <w:r>
@@ -33925,10 +33954,9 @@
         <w:pStyle w:val="Ttulo3"/>
       </w:pPr>
       <w:bookmarkStart w:id="133" w:name="principios-de-diseño-aplicados"/>
-      <w:bookmarkStart w:id="134" w:name="_Toc229242279"/>
+      <w:bookmarkStart w:id="134" w:name="_Toc229485421"/>
       <w:bookmarkEnd w:id="131"/>
       <w:r>
-        <w:lastRenderedPageBreak/>
         <w:t>2.1.6 Principios de Diseño Aplicados</w:t>
       </w:r>
       <w:bookmarkEnd w:id="134"/>
@@ -34519,6 +34547,7 @@
         </w:numPr>
       </w:pPr>
       <w:r>
+        <w:lastRenderedPageBreak/>
         <w:t>Reducción de configuración manual</w:t>
       </w:r>
     </w:p>
@@ -34601,7 +34630,6 @@
         </w:numPr>
       </w:pPr>
       <w:r>
-        <w:lastRenderedPageBreak/>
         <w:t>HTTPS obligatorio</w:t>
       </w:r>
     </w:p>
@@ -34622,7 +34650,7 @@
         <w:pStyle w:val="Ttulo2"/>
       </w:pPr>
       <w:bookmarkStart w:id="141" w:name="stack-tecnológico-seleccionado"/>
-      <w:bookmarkStart w:id="142" w:name="_Toc229242280"/>
+      <w:bookmarkStart w:id="142" w:name="_Toc229485422"/>
       <w:bookmarkEnd w:id="118"/>
       <w:bookmarkEnd w:id="133"/>
       <w:bookmarkEnd w:id="140"/>
@@ -34636,7 +34664,7 @@
         <w:pStyle w:val="Ttulo3"/>
       </w:pPr>
       <w:bookmarkStart w:id="143" w:name="tecnologías-por-capa"/>
-      <w:bookmarkStart w:id="144" w:name="_Toc229242281"/>
+      <w:bookmarkStart w:id="144" w:name="_Toc229485423"/>
       <w:r>
         <w:t>2.2.1 Tecnologías por Capa</w:t>
       </w:r>
@@ -35153,7 +35181,11 @@
               <w:pStyle w:val="Compact"/>
             </w:pPr>
             <w:r>
-              <w:t>WebSockets para geolocalización en vivo, fallback automático, integración nativa con ASP.NET Core</w:t>
+              <w:t xml:space="preserve">WebSockets para geolocalización en vivo, fallback </w:t>
+            </w:r>
+            <w:r>
+              <w:lastRenderedPageBreak/>
+              <w:t>automático, integración nativa con ASP.NET Core</w:t>
             </w:r>
           </w:p>
         </w:tc>
@@ -35172,6 +35204,7 @@
                 <w:b/>
                 <w:bCs/>
               </w:rPr>
+              <w:lastRenderedPageBreak/>
               <w:t>C#</w:t>
             </w:r>
           </w:p>
@@ -35224,11 +35257,7 @@
               <w:pStyle w:val="Compact"/>
             </w:pPr>
             <w:r>
-              <w:t xml:space="preserve">Lenguaje tipado, moderno, orientado a objetos, </w:t>
-            </w:r>
-            <w:r>
-              <w:lastRenderedPageBreak/>
-              <w:t>async/await nativo, LINQ</w:t>
+              <w:t>Lenguaje tipado, moderno, orientado a objetos, async/await nativo, LINQ</w:t>
             </w:r>
           </w:p>
         </w:tc>
@@ -35241,7 +35270,6 @@
       <w:bookmarkStart w:id="146" w:name="frontend-cliente"/>
       <w:bookmarkEnd w:id="145"/>
       <w:r>
-        <w:lastRenderedPageBreak/>
         <w:t>Frontend (Cliente)</w:t>
       </w:r>
     </w:p>
@@ -35831,6 +35859,7 @@
       <w:bookmarkStart w:id="147" w:name="base-de-datos"/>
       <w:bookmarkEnd w:id="146"/>
       <w:r>
+        <w:lastRenderedPageBreak/>
         <w:t>Base de Datos</w:t>
       </w:r>
     </w:p>
@@ -35981,11 +36010,7 @@
               <w:pStyle w:val="Compact"/>
             </w:pPr>
             <w:r>
-              <w:t xml:space="preserve">Motor de base de datos empresarial, robustez, soporte de Microsoft, herramientas de </w:t>
-            </w:r>
-            <w:r>
-              <w:lastRenderedPageBreak/>
-              <w:t>administración, backups automáticos</w:t>
+              <w:t>Motor de base de datos empresarial, robustez, soporte de Microsoft, herramientas de administración, backups automáticos</w:t>
             </w:r>
           </w:p>
         </w:tc>
@@ -36004,7 +36029,6 @@
                 <w:b/>
                 <w:bCs/>
               </w:rPr>
-              <w:lastRenderedPageBreak/>
               <w:t>T-SQL</w:t>
             </w:r>
           </w:p>
@@ -36570,7 +36594,11 @@
               <w:pStyle w:val="Compact"/>
             </w:pPr>
             <w:r>
-              <w:t>Comercial (Freemium)</w:t>
+              <w:t>Comercial (Freemi</w:t>
+            </w:r>
+            <w:r>
+              <w:lastRenderedPageBreak/>
+              <w:t>um)</w:t>
             </w:r>
           </w:p>
         </w:tc>
@@ -36583,6 +36611,7 @@
               <w:pStyle w:val="Compact"/>
             </w:pPr>
             <w:r>
+              <w:lastRenderedPageBreak/>
               <w:t>Mapas y geolocalización</w:t>
             </w:r>
           </w:p>
@@ -36596,7 +36625,11 @@
               <w:pStyle w:val="Compact"/>
             </w:pPr>
             <w:r>
-              <w:t>API estable, amplia documentación, mapas precisos, geocodificación</w:t>
+              <w:t xml:space="preserve">API estable, amplia documentación, mapas precisos, </w:t>
+            </w:r>
+            <w:r>
+              <w:lastRenderedPageBreak/>
+              <w:t>geocodificación</w:t>
             </w:r>
           </w:p>
         </w:tc>
@@ -36615,6 +36648,7 @@
                 <w:b/>
                 <w:bCs/>
               </w:rPr>
+              <w:lastRenderedPageBreak/>
               <w:t>[Futuro] Stripe/PayPal</w:t>
             </w:r>
           </w:p>
@@ -36683,7 +36717,6 @@
         <w:pStyle w:val="Ttulo4"/>
       </w:pPr>
       <w:r>
-        <w:lastRenderedPageBreak/>
         <w:t>Herramientas de Desarrollo</w:t>
       </w:r>
     </w:p>
@@ -37173,7 +37206,7 @@
         <w:pStyle w:val="Ttulo3"/>
       </w:pPr>
       <w:bookmarkStart w:id="151" w:name="X2edbf2817a7a5c2af326d702b369c275b9a3ea0"/>
-      <w:bookmarkStart w:id="152" w:name="_Toc229242282"/>
+      <w:bookmarkStart w:id="152" w:name="_Toc229485424"/>
       <w:bookmarkEnd w:id="143"/>
       <w:bookmarkEnd w:id="150"/>
       <w:r>
@@ -37477,9 +37510,10 @@
         <w:pStyle w:val="Ttulo3"/>
       </w:pPr>
       <w:bookmarkStart w:id="153" w:name="comparación-de-alternativas-tecnológicas"/>
-      <w:bookmarkStart w:id="154" w:name="_Toc229242283"/>
+      <w:bookmarkStart w:id="154" w:name="_Toc229485425"/>
       <w:bookmarkEnd w:id="151"/>
       <w:r>
+        <w:lastRenderedPageBreak/>
         <w:t>2.2.3 Comparación de Alternativas Tecnológicas</w:t>
       </w:r>
       <w:bookmarkEnd w:id="154"/>
@@ -37783,7 +37817,6 @@
                 <w:b/>
                 <w:bCs/>
               </w:rPr>
-              <w:lastRenderedPageBreak/>
               <w:t>Curva de aprendizaje</w:t>
             </w:r>
           </w:p>
@@ -38787,6 +38820,7 @@
                 <w:b/>
                 <w:bCs/>
               </w:rPr>
+              <w:lastRenderedPageBreak/>
               <w:t>Robustez empresarial</w:t>
             </w:r>
           </w:p>
@@ -39115,7 +39149,6 @@
                 <w:b/>
                 <w:bCs/>
               </w:rPr>
-              <w:lastRenderedPageBreak/>
               <w:t>Relacional vs NoSQL</w:t>
             </w:r>
           </w:p>
@@ -39274,7 +39307,7 @@
         <w:pStyle w:val="Ttulo3"/>
       </w:pPr>
       <w:bookmarkStart w:id="158" w:name="trade-offs-y-decisiones-técnicas"/>
-      <w:bookmarkStart w:id="159" w:name="_Toc229242284"/>
+      <w:bookmarkStart w:id="159" w:name="_Toc229485426"/>
       <w:bookmarkEnd w:id="153"/>
       <w:bookmarkEnd w:id="157"/>
       <w:r>
@@ -39285,35 +39318,52 @@
     <w:p>
       <w:pPr>
         <w:pStyle w:val="Ttulo4"/>
+        <w:rPr>
+          <w:lang w:val="en-US"/>
+        </w:rPr>
       </w:pPr>
       <w:bookmarkStart w:id="160" w:name="X024cfc2c8b9f1620ef0c201f2949854430af7e2"/>
       <w:r>
+        <w:rPr>
+          <w:lang w:val="en-US"/>
+        </w:rPr>
         <w:t>Decisión 1: Server-Side Rendering (Razor Pages) vs Client-Side SPA</w:t>
       </w:r>
     </w:p>
     <w:p>
       <w:pPr>
         <w:pStyle w:val="FirstParagraph"/>
+        <w:rPr>
+          <w:lang w:val="en-US"/>
+        </w:rPr>
       </w:pPr>
       <w:r>
         <w:rPr>
           <w:b/>
           <w:bCs/>
+          <w:lang w:val="en-US"/>
         </w:rPr>
         <w:t>Elegido:</w:t>
       </w:r>
       <w:r>
+        <w:rPr>
+          <w:lang w:val="en-US"/>
+        </w:rPr>
         <w:t xml:space="preserve"> Server-Side Rendering (Razor Pages)</w:t>
       </w:r>
     </w:p>
     <w:p>
       <w:pPr>
         <w:pStyle w:val="Textoindependiente"/>
+        <w:rPr>
+          <w:lang w:val="en-US"/>
+        </w:rPr>
       </w:pPr>
       <w:r>
         <w:rPr>
           <w:b/>
           <w:bCs/>
+          <w:lang w:val="en-US"/>
         </w:rPr>
         <w:t>Trade-offs:</w:t>
       </w:r>
@@ -39765,6 +39815,7 @@
                 <w:b/>
                 <w:bCs/>
               </w:rPr>
+              <w:lastRenderedPageBreak/>
               <w:t>Desventajas</w:t>
             </w:r>
           </w:p>
@@ -39868,7 +39919,6 @@
         <w:rPr>
           <w:lang w:val="en-US"/>
         </w:rPr>
-        <w:lastRenderedPageBreak/>
         <w:t>Decisión 3: EF Core vs Dapper vs ADO.NET</w:t>
       </w:r>
     </w:p>
@@ -40183,7 +40233,7 @@
         <w:pStyle w:val="Ttulo2"/>
       </w:pPr>
       <w:bookmarkStart w:id="163" w:name="X08b46f6b46469d0ce05c3cdaaa7f46bbab15726"/>
-      <w:bookmarkStart w:id="164" w:name="_Toc229242285"/>
+      <w:bookmarkStart w:id="164" w:name="_Toc229485427"/>
       <w:bookmarkEnd w:id="141"/>
       <w:bookmarkEnd w:id="158"/>
       <w:bookmarkEnd w:id="162"/>
@@ -40197,7 +40247,7 @@
         <w:pStyle w:val="Ttulo3"/>
       </w:pPr>
       <w:bookmarkStart w:id="165" w:name="hardware-mínimo-y-recomendado-on-premise"/>
-      <w:bookmarkStart w:id="166" w:name="_Toc229242286"/>
+      <w:bookmarkStart w:id="166" w:name="_Toc229485428"/>
       <w:r>
         <w:t>2.3.1 Hardware Mínimo y Recomendado (On-Premise)</w:t>
       </w:r>
@@ -40596,7 +40646,11 @@
               <w:pStyle w:val="Compact"/>
             </w:pPr>
             <w:r>
-              <w:t>IIS 10, .NET 8 Runtime</w:t>
+              <w:t>IIS 10, .NET 8 Runtim</w:t>
+            </w:r>
+            <w:r>
+              <w:lastRenderedPageBreak/>
+              <w:t>e</w:t>
             </w:r>
           </w:p>
         </w:tc>
@@ -40609,7 +40663,12 @@
               <w:pStyle w:val="Compact"/>
             </w:pPr>
             <w:r>
-              <w:t>IIS 10, .NET 8 Runtime + SDK</w:t>
+              <w:lastRenderedPageBreak/>
+              <w:t xml:space="preserve">IIS 10, .NET 8 Runtime + </w:t>
+            </w:r>
+            <w:r>
+              <w:lastRenderedPageBreak/>
+              <w:t>SDK</w:t>
             </w:r>
           </w:p>
         </w:tc>
@@ -40622,6 +40681,7 @@
               <w:pStyle w:val="Compact"/>
             </w:pPr>
             <w:r>
+              <w:lastRenderedPageBreak/>
               <w:t>IIS 10, .NET 8 Runtime, monitoreo</w:t>
             </w:r>
           </w:p>
@@ -40835,7 +40895,6 @@
                 <w:b/>
                 <w:bCs/>
               </w:rPr>
-              <w:lastRenderedPageBreak/>
               <w:t>Disco</w:t>
             </w:r>
           </w:p>
@@ -41084,7 +41143,7 @@
         <w:pStyle w:val="Ttulo3"/>
       </w:pPr>
       <w:bookmarkStart w:id="169" w:name="requerimientos-cloud-azure---recomendado"/>
-      <w:bookmarkStart w:id="170" w:name="_Toc229242287"/>
+      <w:bookmarkStart w:id="170" w:name="_Toc229485429"/>
       <w:bookmarkEnd w:id="165"/>
       <w:bookmarkEnd w:id="168"/>
       <w:r>
@@ -41605,6 +41664,7 @@
                 <w:b/>
                 <w:bCs/>
               </w:rPr>
+              <w:lastRenderedPageBreak/>
               <w:t>Azure App Service</w:t>
             </w:r>
           </w:p>
@@ -41727,7 +41787,6 @@
                 <w:b/>
                 <w:bCs/>
               </w:rPr>
-              <w:lastRenderedPageBreak/>
               <w:t>Application Insights</w:t>
             </w:r>
           </w:p>
@@ -42074,7 +42133,7 @@
         <w:pStyle w:val="Ttulo3"/>
       </w:pPr>
       <w:bookmarkStart w:id="173" w:name="diagrama-de-red-y-topología-de-seguridad"/>
-      <w:bookmarkStart w:id="174" w:name="_Toc229242288"/>
+      <w:bookmarkStart w:id="174" w:name="_Toc229485430"/>
       <w:bookmarkEnd w:id="169"/>
       <w:bookmarkEnd w:id="172"/>
       <w:r>
@@ -42177,6 +42236,7 @@
         <w:rPr>
           <w:rStyle w:val="VerbatimChar"/>
         </w:rPr>
+        <w:lastRenderedPageBreak/>
         <w:t>2. **Zona de Aplicación (App Tier)**</w:t>
       </w:r>
       <w:r>
@@ -42243,7 +42303,6 @@
         <w:rPr>
           <w:rStyle w:val="VerbatimChar"/>
         </w:rPr>
-        <w:lastRenderedPageBreak/>
         <w:t xml:space="preserve">   - Puerto 1433 (solo accesible desde App Tier)</w:t>
       </w:r>
       <w:r>
@@ -42541,10 +42600,9 @@
         <w:pStyle w:val="Ttulo3"/>
       </w:pPr>
       <w:bookmarkStart w:id="175" w:name="Xe4c06a84e90ca3ae4aebf4b78283589bab727d1"/>
-      <w:bookmarkStart w:id="176" w:name="_Toc229242289"/>
+      <w:bookmarkStart w:id="176" w:name="_Toc229485431"/>
       <w:bookmarkEnd w:id="173"/>
       <w:r>
-        <w:lastRenderedPageBreak/>
         <w:t>2.3.4 Entornos de Desarrollo, Pruebas y Producción</w:t>
       </w:r>
       <w:bookmarkEnd w:id="176"/>
@@ -43165,7 +43223,6 @@
       <w:bookmarkStart w:id="179" w:name="ambiente-de-producción"/>
       <w:bookmarkEnd w:id="178"/>
       <w:r>
-        <w:lastRenderedPageBreak/>
         <w:t>Ambiente de Producción</w:t>
       </w:r>
     </w:p>
@@ -43499,7 +43556,7 @@
         <w:pStyle w:val="Ttulo3"/>
       </w:pPr>
       <w:bookmarkStart w:id="180" w:name="X175259f6c772c46516f3f0cd66d2acf42afb533"/>
-      <w:bookmarkStart w:id="181" w:name="_Toc229242290"/>
+      <w:bookmarkStart w:id="181" w:name="_Toc229485432"/>
       <w:bookmarkEnd w:id="175"/>
       <w:bookmarkEnd w:id="179"/>
       <w:r>
@@ -45200,7 +45257,7 @@
         <w:pStyle w:val="Ttulo3"/>
       </w:pPr>
       <w:bookmarkStart w:id="184" w:name="cicd-pipeline-básico-github-actions"/>
-      <w:bookmarkStart w:id="185" w:name="_Toc229242291"/>
+      <w:bookmarkStart w:id="185" w:name="_Toc229485433"/>
       <w:bookmarkEnd w:id="180"/>
       <w:bookmarkEnd w:id="183"/>
       <w:r>
@@ -46310,7 +46367,7 @@
         <w:pStyle w:val="Ttulo2"/>
       </w:pPr>
       <w:bookmarkStart w:id="187" w:name="diseño-de-base-de-datos"/>
-      <w:bookmarkStart w:id="188" w:name="_Toc229242292"/>
+      <w:bookmarkStart w:id="188" w:name="_Toc229485434"/>
       <w:bookmarkEnd w:id="163"/>
       <w:bookmarkEnd w:id="184"/>
       <w:bookmarkEnd w:id="186"/>
@@ -46325,7 +46382,7 @@
         <w:pStyle w:val="Ttulo3"/>
       </w:pPr>
       <w:bookmarkStart w:id="189" w:name="esquema-físico---tablas-principales"/>
-      <w:bookmarkStart w:id="190" w:name="_Toc229242293"/>
+      <w:bookmarkStart w:id="190" w:name="_Toc229485435"/>
       <w:r>
         <w:t>2.4.1 Esquema Físico - Tablas Principales</w:t>
       </w:r>
@@ -53147,7 +53204,7 @@
         <w:pStyle w:val="Ttulo3"/>
       </w:pPr>
       <w:bookmarkStart w:id="200" w:name="diagrama-entidad-relación-er"/>
-      <w:bookmarkStart w:id="201" w:name="_Toc229242294"/>
+      <w:bookmarkStart w:id="201" w:name="_Toc229485436"/>
       <w:bookmarkEnd w:id="189"/>
       <w:bookmarkEnd w:id="199"/>
       <w:r>
@@ -54094,7 +54151,7 @@
         <w:pStyle w:val="Ttulo3"/>
       </w:pPr>
       <w:bookmarkStart w:id="202" w:name="índices-y-estrategias-de-optimización"/>
-      <w:bookmarkStart w:id="203" w:name="_Toc229242295"/>
+      <w:bookmarkStart w:id="203" w:name="_Toc229485437"/>
       <w:bookmarkEnd w:id="200"/>
       <w:r>
         <w:t>2.4.3 Índices y Estrategias de Optimización</w:t>
@@ -54880,7 +54937,7 @@
         <w:pStyle w:val="Ttulo3"/>
       </w:pPr>
       <w:bookmarkStart w:id="206" w:name="X841e3dcd803b679405825e76e3fbe50c9bdc01d"/>
-      <w:bookmarkStart w:id="207" w:name="_Toc229242296"/>
+      <w:bookmarkStart w:id="207" w:name="_Toc229485438"/>
       <w:bookmarkEnd w:id="202"/>
       <w:bookmarkEnd w:id="205"/>
       <w:r>
@@ -55305,7 +55362,7 @@
         <w:pStyle w:val="Ttulo2"/>
       </w:pPr>
       <w:bookmarkStart w:id="212" w:name="diseño-de-apis-e-integración"/>
-      <w:bookmarkStart w:id="213" w:name="_Toc229242297"/>
+      <w:bookmarkStart w:id="213" w:name="_Toc229485439"/>
       <w:bookmarkEnd w:id="187"/>
       <w:bookmarkEnd w:id="206"/>
       <w:bookmarkEnd w:id="211"/>
@@ -55320,7 +55377,7 @@
         <w:pStyle w:val="Ttulo3"/>
       </w:pPr>
       <w:bookmarkStart w:id="214" w:name="endpoints-rest-principales"/>
-      <w:bookmarkStart w:id="215" w:name="_Toc229242298"/>
+      <w:bookmarkStart w:id="215" w:name="_Toc229485440"/>
       <w:r>
         <w:t>2.5.1 Endpoints REST Principales</w:t>
       </w:r>
@@ -58230,7 +58287,7 @@
         <w:pStyle w:val="Ttulo3"/>
       </w:pPr>
       <w:bookmarkStart w:id="219" w:name="X40cbf459f2438c7116efb2ca41add11fb828b4e"/>
-      <w:bookmarkStart w:id="220" w:name="_Toc229242299"/>
+      <w:bookmarkStart w:id="220" w:name="_Toc229485441"/>
       <w:bookmarkEnd w:id="214"/>
       <w:bookmarkEnd w:id="218"/>
       <w:r>
@@ -59354,7 +59411,7 @@
         <w:pStyle w:val="Ttulo3"/>
       </w:pPr>
       <w:bookmarkStart w:id="222" w:name="integración-con-servicios-externos"/>
-      <w:bookmarkStart w:id="223" w:name="_Toc229242300"/>
+      <w:bookmarkStart w:id="223" w:name="_Toc229485442"/>
       <w:bookmarkEnd w:id="219"/>
       <w:bookmarkEnd w:id="221"/>
       <w:r>
@@ -61338,7 +61395,7 @@
         <w:pStyle w:val="Ttulo3"/>
       </w:pPr>
       <w:bookmarkStart w:id="226" w:name="contratos-de-interfaz-openapiswagger"/>
-      <w:bookmarkStart w:id="227" w:name="_Toc229242301"/>
+      <w:bookmarkStart w:id="227" w:name="_Toc229485443"/>
       <w:bookmarkEnd w:id="222"/>
       <w:bookmarkEnd w:id="225"/>
       <w:r>
@@ -63680,7 +63737,7 @@
         <w:pStyle w:val="Ttulo2"/>
       </w:pPr>
       <w:bookmarkStart w:id="228" w:name="patrones-de-diseño-y-buenas-prácticas"/>
-      <w:bookmarkStart w:id="229" w:name="_Toc229242302"/>
+      <w:bookmarkStart w:id="229" w:name="_Toc229485444"/>
       <w:bookmarkEnd w:id="212"/>
       <w:bookmarkEnd w:id="226"/>
       <w:r>
@@ -63693,7 +63750,7 @@
         <w:pStyle w:val="Ttulo3"/>
       </w:pPr>
       <w:bookmarkStart w:id="230" w:name="patrones-de-diseño-aplicados"/>
-      <w:bookmarkStart w:id="231" w:name="_Toc229242303"/>
+      <w:bookmarkStart w:id="231" w:name="_Toc229485445"/>
       <w:r>
         <w:t>2.6.1 Patrones de Diseño Aplicados</w:t>
       </w:r>
@@ -64472,11 +64529,15 @@
     <w:p>
       <w:pPr>
         <w:pStyle w:val="FirstParagraph"/>
+        <w:rPr>
+          <w:lang w:val="en-US"/>
+        </w:rPr>
       </w:pPr>
       <w:r>
         <w:rPr>
           <w:b/>
           <w:bCs/>
+          <w:lang w:val="en-US"/>
         </w:rPr>
         <w:t>Inyección en constructores:</w:t>
       </w:r>
@@ -64484,130 +64545,169 @@
     <w:p>
       <w:pPr>
         <w:pStyle w:val="SourceCode"/>
+        <w:rPr>
+          <w:lang w:val="en-US"/>
+        </w:rPr>
       </w:pPr>
       <w:r>
         <w:rPr>
           <w:rStyle w:val="KeywordTok"/>
+          <w:lang w:val="en-US"/>
         </w:rPr>
         <w:t>public</w:t>
       </w:r>
       <w:r>
         <w:rPr>
           <w:rStyle w:val="NormalTok"/>
+          <w:lang w:val="en-US"/>
         </w:rPr>
         <w:t xml:space="preserve"> </w:t>
       </w:r>
       <w:r>
         <w:rPr>
           <w:rStyle w:val="FunctionTok"/>
+          <w:lang w:val="en-US"/>
         </w:rPr>
         <w:t>MiRutaModel</w:t>
       </w:r>
       <w:r>
         <w:rPr>
           <w:rStyle w:val="OperatorTok"/>
+          <w:lang w:val="en-US"/>
         </w:rPr>
         <w:t>(</w:t>
       </w:r>
       <w:r>
-        <w:br/>
-      </w:r>
-      <w:r>
-        <w:rPr>
-          <w:rStyle w:val="NormalTok"/>
+        <w:rPr>
+          <w:lang w:val="en-US"/>
+        </w:rPr>
+        <w:br/>
+      </w:r>
+      <w:r>
+        <w:rPr>
+          <w:rStyle w:val="NormalTok"/>
+          <w:lang w:val="en-US"/>
         </w:rPr>
         <w:t xml:space="preserve">    IHttpClientFactory httpClientFactory</w:t>
       </w:r>
       <w:r>
         <w:rPr>
           <w:rStyle w:val="OperatorTok"/>
+          <w:lang w:val="en-US"/>
         </w:rPr>
         <w:t>,</w:t>
       </w:r>
       <w:r>
-        <w:br/>
-      </w:r>
-      <w:r>
-        <w:rPr>
-          <w:rStyle w:val="NormalTok"/>
+        <w:rPr>
+          <w:lang w:val="en-US"/>
+        </w:rPr>
+        <w:br/>
+      </w:r>
+      <w:r>
+        <w:rPr>
+          <w:rStyle w:val="NormalTok"/>
+          <w:lang w:val="en-US"/>
         </w:rPr>
         <w:t xml:space="preserve">    ApplicationDbContext context</w:t>
       </w:r>
       <w:r>
         <w:rPr>
           <w:rStyle w:val="OperatorTok"/>
+          <w:lang w:val="en-US"/>
         </w:rPr>
         <w:t>)</w:t>
       </w:r>
       <w:r>
+        <w:rPr>
+          <w:lang w:val="en-US"/>
+        </w:rPr>
         <w:br/>
       </w:r>
       <w:r>
         <w:rPr>
           <w:rStyle w:val="OperatorTok"/>
+          <w:lang w:val="en-US"/>
         </w:rPr>
         <w:t>{</w:t>
       </w:r>
       <w:r>
-        <w:br/>
-      </w:r>
-      <w:r>
-        <w:rPr>
-          <w:rStyle w:val="NormalTok"/>
+        <w:rPr>
+          <w:lang w:val="en-US"/>
+        </w:rPr>
+        <w:br/>
+      </w:r>
+      <w:r>
+        <w:rPr>
+          <w:rStyle w:val="NormalTok"/>
+          <w:lang w:val="en-US"/>
         </w:rPr>
         <w:t xml:space="preserve">    _httpClientFactory </w:t>
       </w:r>
       <w:r>
         <w:rPr>
           <w:rStyle w:val="OperatorTok"/>
+          <w:lang w:val="en-US"/>
         </w:rPr>
         <w:t>=</w:t>
       </w:r>
       <w:r>
         <w:rPr>
           <w:rStyle w:val="NormalTok"/>
+          <w:lang w:val="en-US"/>
         </w:rPr>
         <w:t xml:space="preserve"> httpClientFactory</w:t>
       </w:r>
       <w:r>
         <w:rPr>
           <w:rStyle w:val="OperatorTok"/>
+          <w:lang w:val="en-US"/>
         </w:rPr>
         <w:t>;</w:t>
       </w:r>
       <w:r>
-        <w:br/>
-      </w:r>
-      <w:r>
-        <w:rPr>
-          <w:rStyle w:val="NormalTok"/>
+        <w:rPr>
+          <w:lang w:val="en-US"/>
+        </w:rPr>
+        <w:br/>
+      </w:r>
+      <w:r>
+        <w:rPr>
+          <w:rStyle w:val="NormalTok"/>
+          <w:lang w:val="en-US"/>
         </w:rPr>
         <w:t xml:space="preserve">    _context </w:t>
       </w:r>
       <w:r>
         <w:rPr>
           <w:rStyle w:val="OperatorTok"/>
+          <w:lang w:val="en-US"/>
         </w:rPr>
         <w:t>=</w:t>
       </w:r>
       <w:r>
         <w:rPr>
           <w:rStyle w:val="NormalTok"/>
+          <w:lang w:val="en-US"/>
         </w:rPr>
         <w:t xml:space="preserve"> context</w:t>
       </w:r>
       <w:r>
         <w:rPr>
           <w:rStyle w:val="OperatorTok"/>
+          <w:lang w:val="en-US"/>
         </w:rPr>
         <w:t>;</w:t>
       </w:r>
       <w:r>
+        <w:rPr>
+          <w:lang w:val="en-US"/>
+        </w:rPr>
         <w:br/>
       </w:r>
       <w:r>
         <w:rPr>
           <w:rStyle w:val="OperatorTok"/>
+          <w:lang w:val="en-US"/>
         </w:rPr>
         <w:t>}</w:t>
       </w:r>
@@ -64615,34 +64715,51 @@
     <w:p>
       <w:pPr>
         <w:pStyle w:val="FirstParagraph"/>
+        <w:rPr>
+          <w:lang w:val="en-US"/>
+        </w:rPr>
       </w:pPr>
       <w:r>
         <w:rPr>
           <w:b/>
           <w:bCs/>
+          <w:lang w:val="en-US"/>
         </w:rPr>
         <w:t>Beneficio:</w:t>
       </w:r>
       <w:r>
+        <w:rPr>
+          <w:lang w:val="en-US"/>
+        </w:rPr>
         <w:t xml:space="preserve"> Desacoplamiento, facilita testing (mocking).</w:t>
       </w:r>
     </w:p>
     <w:p>
       <w:pPr>
         <w:pStyle w:val="Ttulo4"/>
+        <w:rPr>
+          <w:lang w:val="en-US"/>
+        </w:rPr>
       </w:pPr>
       <w:bookmarkStart w:id="234" w:name="repository-pattern-implícito-con-ef-core"/>
       <w:bookmarkEnd w:id="233"/>
       <w:r>
+        <w:rPr>
+          <w:lang w:val="en-US"/>
+        </w:rPr>
         <w:t xml:space="preserve">3. </w:t>
       </w:r>
       <w:r>
         <w:rPr>
           <w:b/>
+          <w:lang w:val="en-US"/>
         </w:rPr>
         <w:t>Repository Pattern</w:t>
       </w:r>
       <w:r>
+        <w:rPr>
+          <w:lang w:val="en-US"/>
+        </w:rPr>
         <w:t xml:space="preserve"> (Implícito con EF Core)</w:t>
       </w:r>
     </w:p>
@@ -66749,7 +66866,7 @@
         <w:pStyle w:val="Ttulo3"/>
       </w:pPr>
       <w:bookmarkStart w:id="238" w:name="principios-solid-aplicados"/>
-      <w:bookmarkStart w:id="239" w:name="_Toc229242304"/>
+      <w:bookmarkStart w:id="239" w:name="_Toc229485446"/>
       <w:bookmarkEnd w:id="230"/>
       <w:bookmarkEnd w:id="237"/>
       <w:r>
@@ -67020,7 +67137,7 @@
         </w:rPr>
       </w:pPr>
       <w:bookmarkStart w:id="240" w:name="estrategia-de-testing"/>
-      <w:bookmarkStart w:id="241" w:name="_Toc229242305"/>
+      <w:bookmarkStart w:id="241" w:name="_Toc229485447"/>
       <w:bookmarkEnd w:id="238"/>
       <w:r>
         <w:rPr>
@@ -68721,7 +68838,7 @@
         <w:pStyle w:val="Ttulo3"/>
       </w:pPr>
       <w:bookmarkStart w:id="245" w:name="buenas-prácticas-de-código"/>
-      <w:bookmarkStart w:id="246" w:name="_Toc229242306"/>
+      <w:bookmarkStart w:id="246" w:name="_Toc229485448"/>
       <w:bookmarkEnd w:id="240"/>
       <w:bookmarkEnd w:id="244"/>
       <w:r>
@@ -70450,7 +70567,7 @@
         <w:pStyle w:val="Ttulo2"/>
       </w:pPr>
       <w:bookmarkStart w:id="251" w:name="plan-de-implementación-y-roadmap-técnico"/>
-      <w:bookmarkStart w:id="252" w:name="_Toc229242307"/>
+      <w:bookmarkStart w:id="252" w:name="_Toc229485449"/>
       <w:bookmarkEnd w:id="228"/>
       <w:bookmarkEnd w:id="245"/>
       <w:bookmarkEnd w:id="250"/>
@@ -70464,7 +70581,7 @@
         <w:pStyle w:val="Ttulo3"/>
       </w:pPr>
       <w:bookmarkStart w:id="253" w:name="fases-del-proyecto-completadas"/>
-      <w:bookmarkStart w:id="254" w:name="_Toc229242308"/>
+      <w:bookmarkStart w:id="254" w:name="_Toc229485450"/>
       <w:r>
         <w:t>2.7.1 Fases del Proyecto (Completadas)</w:t>
       </w:r>
@@ -71112,7 +71229,7 @@
         <w:pStyle w:val="Ttulo3"/>
       </w:pPr>
       <w:bookmarkStart w:id="255" w:name="roadmap-futuro-v2.0-y-posteriores"/>
-      <w:bookmarkStart w:id="256" w:name="_Toc229242309"/>
+      <w:bookmarkStart w:id="256" w:name="_Toc229485451"/>
       <w:bookmarkEnd w:id="253"/>
       <w:r>
         <w:lastRenderedPageBreak/>
@@ -71838,7 +71955,7 @@
         <w:pStyle w:val="Ttulo3"/>
       </w:pPr>
       <w:bookmarkStart w:id="260" w:name="estrategia-de-devops"/>
-      <w:bookmarkStart w:id="261" w:name="_Toc229242310"/>
+      <w:bookmarkStart w:id="261" w:name="_Toc229485452"/>
       <w:bookmarkEnd w:id="255"/>
       <w:bookmarkEnd w:id="259"/>
       <w:r>
@@ -72695,7 +72812,7 @@
         <w:pStyle w:val="Ttulo2"/>
       </w:pPr>
       <w:bookmarkStart w:id="265" w:name="Xa5735e14799316f66571e3461e39903e67476a6"/>
-      <w:bookmarkStart w:id="266" w:name="_Toc229242311"/>
+      <w:bookmarkStart w:id="266" w:name="_Toc229485453"/>
       <w:bookmarkEnd w:id="251"/>
       <w:bookmarkEnd w:id="260"/>
       <w:bookmarkEnd w:id="264"/>
@@ -72709,7 +72826,7 @@
         <w:pStyle w:val="Ttulo3"/>
       </w:pPr>
       <w:bookmarkStart w:id="267" w:name="matriz-de-riesgos-técnicos"/>
-      <w:bookmarkStart w:id="268" w:name="_Toc229242312"/>
+      <w:bookmarkStart w:id="268" w:name="_Toc229485454"/>
       <w:r>
         <w:t>2.8.1 Matriz de Riesgos Técnicos</w:t>
       </w:r>
@@ -74117,7 +74234,7 @@
         <w:pStyle w:val="Ttulo3"/>
       </w:pPr>
       <w:bookmarkStart w:id="269" w:name="plan-de-respuesta-a-incidentes"/>
-      <w:bookmarkStart w:id="270" w:name="_Toc229242313"/>
+      <w:bookmarkStart w:id="270" w:name="_Toc229485455"/>
       <w:bookmarkEnd w:id="267"/>
       <w:r>
         <w:t>2.8.2 Plan de Respuesta a Incidentes</w:t>
@@ -74635,7 +74752,7 @@
         <w:pStyle w:val="Ttulo3"/>
       </w:pPr>
       <w:bookmarkStart w:id="274" w:name="estrategia-de-backup-y-recuperación"/>
-      <w:bookmarkStart w:id="275" w:name="_Toc229242314"/>
+      <w:bookmarkStart w:id="275" w:name="_Toc229485456"/>
       <w:bookmarkEnd w:id="269"/>
       <w:bookmarkEnd w:id="273"/>
       <w:r>
@@ -75369,7 +75486,7 @@
         <w:pStyle w:val="Ttulo3"/>
       </w:pPr>
       <w:bookmarkStart w:id="278" w:name="lessons-learned-post-mortem"/>
-      <w:bookmarkStart w:id="279" w:name="_Toc229242315"/>
+      <w:bookmarkStart w:id="279" w:name="_Toc229485457"/>
       <w:bookmarkEnd w:id="274"/>
       <w:bookmarkEnd w:id="277"/>
       <w:r>

</xml_diff>